<commit_message>
"Improved Featrues & UX"
</commit_message>
<xml_diff>
--- a/public/SKEAP Application Form (2).docx
+++ b/public/SKEAP Application Form (2).docx
@@ -1,6 +1,6 @@
 
 <file path=word/document.xml><?xml version="1.0" encoding="utf-8"?>
-<w:document xmlns:wpc="http://schemas.microsoft.com/office/word/2010/wordprocessingCanvas" xmlns:cx="http://schemas.microsoft.com/office/drawing/2014/chartex" xmlns:cx1="http://schemas.microsoft.com/office/drawing/2015/9/8/chartex" xmlns:cx2="http://schemas.microsoft.com/office/drawing/2015/10/21/chartex" xmlns:cx3="http://schemas.microsoft.com/office/drawing/2016/5/9/chartex" xmlns:cx4="http://schemas.microsoft.com/office/drawing/2016/5/10/chartex" xmlns:cx5="http://schemas.microsoft.com/office/drawing/2016/5/11/chartex" xmlns:cx6="http://schemas.microsoft.com/office/drawing/2016/5/12/chartex" xmlns:cx7="http://schemas.microsoft.com/office/drawing/2016/5/13/chartex" xmlns:cx8="http://schemas.microsoft.com/office/drawing/2016/5/14/chartex" xmlns:mc="http://schemas.openxmlformats.org/markup-compatibility/2006" xmlns:aink="http://schemas.microsoft.com/office/drawing/2016/ink" xmlns:am3d="http://schemas.microsoft.com/office/drawing/2017/model3d" xmlns:o="urn:schemas-microsoft-com:office:office" xmlns:oel="http://schemas.microsoft.com/office/2019/extlst" xmlns:r="http://schemas.openxmlformats.org/officeDocument/2006/relationships" xmlns:m="http://schemas.openxmlformats.org/officeDocument/2006/math" xmlns:v="urn:schemas-microsoft-com:vml" xmlns:wp14="http://schemas.microsoft.com/office/word/2010/wordprocessingDrawing" xmlns:wp="http://schemas.openxmlformats.org/drawingml/2006/wordprocessingDrawing" xmlns:w10="urn:schemas-microsoft-com:office:word" xmlns:w="http://schemas.openxmlformats.org/wordprocessingml/2006/main" xmlns:w14="http://schemas.microsoft.com/office/word/2010/wordml" xmlns:w15="http://schemas.microsoft.com/office/word/2012/wordml" xmlns:w16cex="http://schemas.microsoft.com/office/word/2018/wordml/cex" xmlns:w16cid="http://schemas.microsoft.com/office/word/2016/wordml/cid" xmlns:w16="http://schemas.microsoft.com/office/word/2018/wordml" xmlns:w16du="http://schemas.microsoft.com/office/word/2023/wordml/word16du" xmlns:w16sdtdh="http://schemas.microsoft.com/office/word/2020/wordml/sdtdatahash" xmlns:w16se="http://schemas.microsoft.com/office/word/2015/wordml/symex" xmlns:wpg="http://schemas.microsoft.com/office/word/2010/wordprocessingGroup" xmlns:wpi="http://schemas.microsoft.com/office/word/2010/wordprocessingInk" xmlns:wne="http://schemas.microsoft.com/office/word/2006/wordml" xmlns:wps="http://schemas.microsoft.com/office/word/2010/wordprocessingShape" mc:Ignorable="w14 w15 w16se w16cid w16 w16cex w16sdtdh w16du wp14">
+<w:document xmlns:wpc="http://schemas.microsoft.com/office/word/2010/wordprocessingCanvas" xmlns:mc="http://schemas.openxmlformats.org/markup-compatibility/2006" xmlns:o="urn:schemas-microsoft-com:office:office" xmlns:r="http://schemas.openxmlformats.org/officeDocument/2006/relationships" xmlns:m="http://schemas.openxmlformats.org/officeDocument/2006/math" xmlns:v="urn:schemas-microsoft-com:vml" xmlns:wp14="http://schemas.microsoft.com/office/word/2010/wordprocessingDrawing" xmlns:wp="http://schemas.openxmlformats.org/drawingml/2006/wordprocessingDrawing" xmlns:w="http://schemas.openxmlformats.org/wordprocessingml/2006/main" xmlns:w14="http://schemas.microsoft.com/office/word/2010/wordml" xmlns:w10="urn:schemas-microsoft-com:office:word" xmlns:w15="http://schemas.microsoft.com/office/word/2012/wordml" xmlns:wpg="http://schemas.microsoft.com/office/word/2010/wordprocessingGroup" xmlns:wpi="http://schemas.microsoft.com/office/word/2010/wordprocessingInk" xmlns:wne="http://schemas.microsoft.com/office/word/2006/wordml" xmlns:wps="http://schemas.microsoft.com/office/word/2010/wordprocessingShape" xmlns:wpsCustomData="http://www.wps.cn/officeDocument/2013/wpsCustomData" mc:Ignorable="w14 w15 wp14">
   <w:body>
     <w:p>
       <w:pPr>
@@ -17,13 +17,12 @@
         <w:rPr>
           <w:rFonts w:ascii="Bernard MT Condensed" w:hAnsi="Bernard MT Condensed"/>
           <w:b/>
-          <w:noProof/>
           <w:sz w:val="20"/>
         </w:rPr>
         <mc:AlternateContent>
           <mc:Choice Requires="wps">
             <w:drawing>
-              <wp:anchor distT="0" distB="0" distL="114300" distR="114300" simplePos="0" relativeHeight="251659264" behindDoc="1" locked="0" layoutInCell="1" allowOverlap="1" wp14:anchorId="6E007AC7" wp14:editId="237303AE">
+              <wp:anchor distT="0" distB="0" distL="114300" distR="114300" simplePos="0" relativeHeight="251659264" behindDoc="1" locked="0" layoutInCell="1" allowOverlap="1">
                 <wp:simplePos x="0" y="0"/>
                 <wp:positionH relativeFrom="column">
                   <wp:posOffset>4724400</wp:posOffset>
@@ -74,6 +73,14 @@
                             <w:pPr>
                               <w:jc w:val="center"/>
                             </w:pPr>
+                            <w:r>
+                              <w:rPr>
+                                <w:rFonts w:ascii="SimSun" w:hAnsi="SimSun" w:eastAsia="SimSun" w:cs="SimSun"/>
+                                <w:sz w:val="24"/>
+                                <w:szCs w:val="24"/>
+                              </w:rPr>
+                              <w:t>{%profilePhoto}</w:t>
+                            </w:r>
                           </w:p>
                         </w:txbxContent>
                       </wps:txbx>
@@ -88,13 +95,25 @@
           </mc:Choice>
           <mc:Fallback>
             <w:pict>
-              <v:rect w14:anchorId="6E007AC7" id="Rectangle 1" o:spid="_x0000_s1026" style="position:absolute;margin-left:372pt;margin-top:3.9pt;width:2in;height:2in;z-index:-251657216;visibility:visible;mso-wrap-style:square;mso-wrap-distance-left:9pt;mso-wrap-distance-top:0;mso-wrap-distance-right:9pt;mso-wrap-distance-bottom:0;mso-position-horizontal:absolute;mso-position-horizontal-relative:text;mso-position-vertical:absolute;mso-position-vertical-relative:text;v-text-anchor:middle" o:gfxdata="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" fillcolor="white [3201]" strokecolor="black [3213]" strokeweight="1pt">
+              <v:rect id="_x0000_s1026" o:spid="_x0000_s1026" o:spt="1" style="position:absolute;left:0pt;margin-left:372pt;margin-top:3.9pt;height:144pt;width:144pt;z-index:-251657216;v-text-anchor:middle;mso-width-relative:page;mso-height-relative:page;" fillcolor="#FFFFFF [3201]" filled="t" stroked="t" coordsize="21600,21600" o:gfxdata="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">
+                <v:fill on="t" focussize="0,0"/>
+                <v:stroke weight="1pt" color="#000000 [3213]" miterlimit="8" joinstyle="miter"/>
+                <v:imagedata o:title=""/>
+                <o:lock v:ext="edit" aspectratio="f"/>
                 <v:textbox>
                   <w:txbxContent>
                     <w:p>
                       <w:pPr>
                         <w:jc w:val="center"/>
                       </w:pPr>
+                      <w:r>
+                        <w:rPr>
+                          <w:rFonts w:ascii="SimSun" w:hAnsi="SimSun" w:eastAsia="SimSun" w:cs="SimSun"/>
+                          <w:sz w:val="24"/>
+                          <w:szCs w:val="24"/>
+                        </w:rPr>
+                        <w:t>{%profilePhoto}</w:t>
+                      </w:r>
                     </w:p>
                   </w:txbxContent>
                 </v:textbox>
@@ -287,20 +306,53 @@
         </w:rPr>
         <w:t>“Skolar para sa Kabataan ng Barangay Pico”</w:t>
       </w:r>
+      <w:bookmarkStart w:id="0" w:name="_GoBack"/>
+      <w:bookmarkEnd w:id="0"/>
     </w:p>
     <w:tbl>
       <w:tblPr>
-        <w:tblStyle w:val="TableGrid"/>
+        <w:tblStyle w:val="7"/>
         <w:tblpPr w:leftFromText="180" w:rightFromText="180" w:vertAnchor="text" w:tblpY="202"/>
         <w:tblW w:w="0" w:type="auto"/>
-        <w:tblLook w:val="04A0" w:firstRow="1" w:lastRow="0" w:firstColumn="1" w:lastColumn="0" w:noHBand="0" w:noVBand="1"/>
+        <w:tblInd w:w="0" w:type="dxa"/>
+        <w:tblBorders>
+          <w:top w:val="single" w:color="auto" w:sz="4" w:space="0"/>
+          <w:left w:val="single" w:color="auto" w:sz="4" w:space="0"/>
+          <w:bottom w:val="single" w:color="auto" w:sz="4" w:space="0"/>
+          <w:right w:val="single" w:color="auto" w:sz="4" w:space="0"/>
+          <w:insideH w:val="single" w:color="auto" w:sz="4" w:space="0"/>
+          <w:insideV w:val="single" w:color="auto" w:sz="4" w:space="0"/>
+        </w:tblBorders>
+        <w:tblLayout w:type="autofit"/>
+        <w:tblCellMar>
+          <w:top w:w="0" w:type="dxa"/>
+          <w:left w:w="108" w:type="dxa"/>
+          <w:bottom w:w="0" w:type="dxa"/>
+          <w:right w:w="108" w:type="dxa"/>
+        </w:tblCellMar>
       </w:tblPr>
       <w:tblGrid>
         <w:gridCol w:w="10456"/>
       </w:tblGrid>
       <w:tr>
+        <w:tblPrEx>
+          <w:tblBorders>
+            <w:top w:val="single" w:color="auto" w:sz="4" w:space="0"/>
+            <w:left w:val="single" w:color="auto" w:sz="4" w:space="0"/>
+            <w:bottom w:val="single" w:color="auto" w:sz="4" w:space="0"/>
+            <w:right w:val="single" w:color="auto" w:sz="4" w:space="0"/>
+            <w:insideH w:val="single" w:color="auto" w:sz="4" w:space="0"/>
+            <w:insideV w:val="single" w:color="auto" w:sz="4" w:space="0"/>
+          </w:tblBorders>
+          <w:tblCellMar>
+            <w:top w:w="0" w:type="dxa"/>
+            <w:left w:w="108" w:type="dxa"/>
+            <w:bottom w:w="0" w:type="dxa"/>
+            <w:right w:w="108" w:type="dxa"/>
+          </w:tblCellMar>
+        </w:tblPrEx>
         <w:trPr>
-          <w:trHeight w:val="347"/>
+          <w:trHeight w:val="347" w:hRule="atLeast"/>
         </w:trPr>
         <w:tc>
           <w:tcPr>
@@ -324,6 +376,11 @@
                 <w:b/>
                 <w:color w:val="FFFFFF" w:themeColor="background1"/>
                 <w:sz w:val="24"/>
+                <w14:textFill>
+                  <w14:solidFill>
+                    <w14:schemeClr w14:val="bg1"/>
+                  </w14:solidFill>
+                </w14:textFill>
               </w:rPr>
               <w:t>PERSONAL INFORMATION</w:t>
             </w:r>
@@ -331,14 +388,30 @@
         </w:tc>
       </w:tr>
       <w:tr>
+        <w:tblPrEx>
+          <w:tblBorders>
+            <w:top w:val="single" w:color="auto" w:sz="4" w:space="0"/>
+            <w:left w:val="single" w:color="auto" w:sz="4" w:space="0"/>
+            <w:bottom w:val="single" w:color="auto" w:sz="4" w:space="0"/>
+            <w:right w:val="single" w:color="auto" w:sz="4" w:space="0"/>
+            <w:insideH w:val="single" w:color="auto" w:sz="4" w:space="0"/>
+            <w:insideV w:val="single" w:color="auto" w:sz="4" w:space="0"/>
+          </w:tblBorders>
+          <w:tblCellMar>
+            <w:top w:w="0" w:type="dxa"/>
+            <w:left w:w="108" w:type="dxa"/>
+            <w:bottom w:w="0" w:type="dxa"/>
+            <w:right w:w="108" w:type="dxa"/>
+          </w:tblCellMar>
+        </w:tblPrEx>
         <w:trPr>
-          <w:trHeight w:val="347"/>
+          <w:trHeight w:val="347" w:hRule="atLeast"/>
         </w:trPr>
         <w:tc>
           <w:tcPr>
             <w:tcW w:w="10456" w:type="dxa"/>
             <w:tcBorders>
-              <w:bottom w:val="double" w:sz="4" w:space="0" w:color="auto"/>
+              <w:bottom w:val="double" w:color="auto" w:sz="4" w:space="0"/>
             </w:tcBorders>
             <w:shd w:val="clear" w:color="auto" w:fill="FFFFFF" w:themeFill="background1"/>
             <w:vAlign w:val="center"/>
@@ -382,11 +455,27 @@
         </w:tc>
       </w:tr>
       <w:tr>
+        <w:tblPrEx>
+          <w:tblBorders>
+            <w:top w:val="single" w:color="auto" w:sz="4" w:space="0"/>
+            <w:left w:val="single" w:color="auto" w:sz="4" w:space="0"/>
+            <w:bottom w:val="single" w:color="auto" w:sz="4" w:space="0"/>
+            <w:right w:val="single" w:color="auto" w:sz="4" w:space="0"/>
+            <w:insideH w:val="single" w:color="auto" w:sz="4" w:space="0"/>
+            <w:insideV w:val="single" w:color="auto" w:sz="4" w:space="0"/>
+          </w:tblBorders>
+          <w:tblCellMar>
+            <w:top w:w="0" w:type="dxa"/>
+            <w:left w:w="108" w:type="dxa"/>
+            <w:bottom w:w="0" w:type="dxa"/>
+            <w:right w:w="108" w:type="dxa"/>
+          </w:tblCellMar>
+        </w:tblPrEx>
         <w:tc>
           <w:tcPr>
             <w:tcW w:w="10456" w:type="dxa"/>
             <w:tcBorders>
-              <w:top w:val="double" w:sz="4" w:space="0" w:color="auto"/>
+              <w:top w:val="double" w:color="auto" w:sz="4" w:space="0"/>
             </w:tcBorders>
           </w:tcPr>
           <w:p>
@@ -407,13 +496,91 @@
                 <w:rFonts w:ascii="Bookman Old Style" w:hAnsi="Bookman Old Style"/>
                 <w:b/>
               </w:rPr>
-              <w:t xml:space="preserve"> _____________________________________________ </w:t>
-            </w:r>
-            <w:r>
-              <w:rPr>
-                <w:rFonts w:ascii="Bookman Old Style" w:hAnsi="Bookman Old Style"/>
-              </w:rPr>
-              <w:t>Gender: ____ Age: ____ Civil Status: ____</w:t>
+              <w:t xml:space="preserve"> </w:t>
+            </w:r>
+            <w:r>
+              <w:rPr>
+                <w:rFonts w:ascii="SimSun" w:hAnsi="SimSun" w:eastAsia="SimSun" w:cs="SimSun"/>
+                <w:sz w:val="24"/>
+                <w:szCs w:val="24"/>
+              </w:rPr>
+              <w:t>{applicantName}</w:t>
+            </w:r>
+            <w:r>
+              <w:rPr>
+                <w:rFonts w:hint="default" w:ascii="SimSun" w:hAnsi="SimSun" w:eastAsia="SimSun" w:cs="SimSun"/>
+                <w:sz w:val="24"/>
+                <w:szCs w:val="24"/>
+                <w:lang w:val="en-US"/>
+              </w:rPr>
+              <w:t xml:space="preserve">             </w:t>
+            </w:r>
+            <w:r>
+              <w:rPr>
+                <w:rFonts w:ascii="Bookman Old Style" w:hAnsi="Bookman Old Style"/>
+              </w:rPr>
+              <w:t>Gender:</w:t>
+            </w:r>
+            <w:r>
+              <w:rPr>
+                <w:rFonts w:ascii="SimSun" w:hAnsi="SimSun" w:eastAsia="SimSun" w:cs="SimSun"/>
+                <w:sz w:val="24"/>
+                <w:szCs w:val="24"/>
+              </w:rPr>
+              <w:t>{gender}</w:t>
+            </w:r>
+            <w:r>
+              <w:rPr>
+                <w:rFonts w:hint="default" w:ascii="SimSun" w:hAnsi="SimSun" w:eastAsia="SimSun" w:cs="SimSun"/>
+                <w:sz w:val="24"/>
+                <w:szCs w:val="24"/>
+                <w:lang w:val="en-US"/>
+              </w:rPr>
+              <w:t xml:space="preserve">  </w:t>
+            </w:r>
+            <w:r>
+              <w:rPr>
+                <w:rFonts w:ascii="Bookman Old Style" w:hAnsi="Bookman Old Style"/>
+              </w:rPr>
+              <w:t>Age:</w:t>
+            </w:r>
+            <w:r>
+              <w:rPr>
+                <w:rFonts w:ascii="SimSun" w:hAnsi="SimSun" w:eastAsia="SimSun" w:cs="SimSun"/>
+                <w:sz w:val="24"/>
+                <w:szCs w:val="24"/>
+              </w:rPr>
+              <w:t>{age</w:t>
+            </w:r>
+            <w:r>
+              <w:rPr>
+                <w:rFonts w:hint="default" w:ascii="SimSun" w:hAnsi="SimSun" w:eastAsia="SimSun" w:cs="SimSun"/>
+                <w:sz w:val="24"/>
+                <w:szCs w:val="24"/>
+                <w:lang w:val="en-US"/>
+              </w:rPr>
+              <w:t>}</w:t>
+            </w:r>
+            <w:r>
+              <w:rPr>
+                <w:rFonts w:hint="default" w:ascii="Bookman Old Style" w:hAnsi="Bookman Old Style"/>
+                <w:lang w:val="en-US"/>
+              </w:rPr>
+              <w:t xml:space="preserve"> </w:t>
+            </w:r>
+            <w:r>
+              <w:rPr>
+                <w:rFonts w:ascii="Bookman Old Style" w:hAnsi="Bookman Old Style"/>
+              </w:rPr>
+              <w:t>Civil Status:</w:t>
+            </w:r>
+            <w:r>
+              <w:rPr>
+                <w:rFonts w:ascii="SimSun" w:hAnsi="SimSun" w:eastAsia="SimSun" w:cs="SimSun"/>
+                <w:sz w:val="24"/>
+                <w:szCs w:val="24"/>
+              </w:rPr>
+              <w:t>{civilStatus}</w:t>
             </w:r>
           </w:p>
           <w:p>
@@ -427,21 +594,72 @@
               <w:rPr>
                 <w:rFonts w:ascii="Bookman Old Style" w:hAnsi="Bookman Old Style"/>
               </w:rPr>
-              <w:t>Permanent Address: ________________________________________________________________________</w:t>
+              <w:t xml:space="preserve">Permanent Address: </w:t>
+            </w:r>
+            <w:r>
+              <w:rPr>
+                <w:rFonts w:ascii="SimSun" w:hAnsi="SimSun" w:eastAsia="SimSun" w:cs="SimSun"/>
+                <w:sz w:val="24"/>
+                <w:szCs w:val="24"/>
+              </w:rPr>
+              <w:t>{permanentAddress}</w:t>
             </w:r>
           </w:p>
           <w:p>
             <w:pPr>
               <w:spacing w:after="0" w:line="240" w:lineRule="auto"/>
               <w:rPr>
-                <w:rFonts w:ascii="Bookman Old Style" w:hAnsi="Bookman Old Style"/>
+                <w:rFonts w:hint="default" w:ascii="Bookman Old Style" w:hAnsi="Bookman Old Style"/>
+                <w:lang w:val="en-US"/>
               </w:rPr>
             </w:pPr>
             <w:r>
               <w:rPr>
                 <w:rFonts w:ascii="Bookman Old Style" w:hAnsi="Bookman Old Style"/>
               </w:rPr>
-              <w:t>Date of Birth: _______________________________  Place of Birth: ________________________________</w:t>
+              <w:t xml:space="preserve">Date of Birth: </w:t>
+            </w:r>
+            <w:r>
+              <w:rPr>
+                <w:rFonts w:ascii="SimSun" w:hAnsi="SimSun" w:eastAsia="SimSun" w:cs="SimSun"/>
+                <w:sz w:val="24"/>
+                <w:szCs w:val="24"/>
+              </w:rPr>
+              <w:t>{dateOfBirth}</w:t>
+            </w:r>
+            <w:r>
+              <w:rPr>
+                <w:rFonts w:ascii="Bookman Old Style" w:hAnsi="Bookman Old Style"/>
+              </w:rPr>
+              <w:t xml:space="preserve"> </w:t>
+            </w:r>
+            <w:r>
+              <w:rPr>
+                <w:rFonts w:hint="default" w:ascii="Bookman Old Style" w:hAnsi="Bookman Old Style"/>
+                <w:lang w:val="en-US"/>
+              </w:rPr>
+              <w:t xml:space="preserve">                                                     </w:t>
+            </w:r>
+            <w:r>
+              <w:rPr>
+                <w:rFonts w:ascii="Bookman Old Style" w:hAnsi="Bookman Old Style"/>
+              </w:rPr>
+              <w:t>Place of Birth:</w:t>
+            </w:r>
+            <w:r>
+              <w:rPr>
+                <w:rFonts w:hint="default" w:ascii="Bookman Old Style" w:hAnsi="Bookman Old Style"/>
+                <w:lang w:val="en-US"/>
+              </w:rPr>
+              <w:t xml:space="preserve"> </w:t>
+            </w:r>
+            <w:r>
+              <w:rPr>
+                <w:rFonts w:ascii="SimSun" w:hAnsi="SimSun" w:eastAsia="SimSun" w:cs="SimSun"/>
+                <w:sz w:val="24"/>
+                <w:szCs w:val="24"/>
+              </w:rPr>
+              <w:t>{placeOfBirth}</w:t>
             </w:r>
           </w:p>
           <w:p>
@@ -455,7 +673,42 @@
               <w:rPr>
                 <w:rFonts w:ascii="Bookman Old Style" w:hAnsi="Bookman Old Style"/>
               </w:rPr>
-              <w:t>Contact Number: _________________________  Email Address: _________________________________</w:t>
+              <w:t xml:space="preserve">Contact Number: </w:t>
+            </w:r>
+            <w:r>
+              <w:rPr>
+                <w:rFonts w:ascii="SimSun" w:hAnsi="SimSun" w:eastAsia="SimSun" w:cs="SimSun"/>
+                <w:sz w:val="24"/>
+                <w:szCs w:val="24"/>
+              </w:rPr>
+              <w:t>{contactNumber}</w:t>
+            </w:r>
+            <w:r>
+              <w:rPr>
+                <w:rFonts w:ascii="Bookman Old Style" w:hAnsi="Bookman Old Style"/>
+              </w:rPr>
+              <w:t xml:space="preserve"> </w:t>
+            </w:r>
+            <w:r>
+              <w:rPr>
+                <w:rFonts w:hint="default" w:ascii="Bookman Old Style" w:hAnsi="Bookman Old Style"/>
+                <w:lang w:val="en-US"/>
+              </w:rPr>
+              <w:t xml:space="preserve">                       </w:t>
+            </w:r>
+            <w:r>
+              <w:rPr>
+                <w:rFonts w:ascii="Bookman Old Style" w:hAnsi="Bookman Old Style"/>
+              </w:rPr>
+              <w:t xml:space="preserve">Email Address: </w:t>
+            </w:r>
+            <w:r>
+              <w:rPr>
+                <w:rFonts w:ascii="SimSun" w:hAnsi="SimSun" w:eastAsia="SimSun" w:cs="SimSun"/>
+                <w:sz w:val="24"/>
+                <w:szCs w:val="24"/>
+              </w:rPr>
+              <w:t>{emailAddress}</w:t>
             </w:r>
           </w:p>
           <w:p>
@@ -469,7 +722,15 @@
               <w:rPr>
                 <w:rFonts w:ascii="Bookman Old Style" w:hAnsi="Bookman Old Style"/>
               </w:rPr>
-              <w:t>School: _____________________________________________________________________________________</w:t>
+              <w:t xml:space="preserve">School: </w:t>
+            </w:r>
+            <w:r>
+              <w:rPr>
+                <w:rFonts w:ascii="SimSun" w:hAnsi="SimSun" w:eastAsia="SimSun" w:cs="SimSun"/>
+                <w:sz w:val="24"/>
+                <w:szCs w:val="24"/>
+              </w:rPr>
+              <w:t>{school}</w:t>
             </w:r>
           </w:p>
           <w:p>
@@ -483,14 +744,65 @@
               <w:rPr>
                 <w:rFonts w:ascii="Bookman Old Style" w:hAnsi="Bookman Old Style"/>
               </w:rPr>
-              <w:t>Grade/ Year: ___________________________________  Course: ___________________________________</w:t>
+              <w:t xml:space="preserve">Grade/ Year: </w:t>
+            </w:r>
+            <w:r>
+              <w:rPr>
+                <w:rFonts w:ascii="SimSun" w:hAnsi="SimSun" w:eastAsia="SimSun" w:cs="SimSun"/>
+                <w:sz w:val="24"/>
+                <w:szCs w:val="24"/>
+              </w:rPr>
+              <w:t>{yearLevel}</w:t>
+            </w:r>
+            <w:r>
+              <w:rPr>
+                <w:rFonts w:ascii="Bookman Old Style" w:hAnsi="Bookman Old Style"/>
+              </w:rPr>
+              <w:t xml:space="preserve">  </w:t>
+            </w:r>
+            <w:r>
+              <w:rPr>
+                <w:rFonts w:hint="default" w:ascii="Bookman Old Style" w:hAnsi="Bookman Old Style"/>
+                <w:lang w:val="en-US"/>
+              </w:rPr>
+              <w:t xml:space="preserve">                                                                            </w:t>
+            </w:r>
+            <w:r>
+              <w:rPr>
+                <w:rFonts w:ascii="Bookman Old Style" w:hAnsi="Bookman Old Style"/>
+              </w:rPr>
+              <w:t xml:space="preserve">Course: </w:t>
+            </w:r>
+            <w:r>
+              <w:rPr>
+                <w:rFonts w:ascii="SimSun" w:hAnsi="SimSun" w:eastAsia="SimSun" w:cs="SimSun"/>
+                <w:sz w:val="24"/>
+                <w:szCs w:val="24"/>
+              </w:rPr>
+              <w:t>{course}</w:t>
             </w:r>
           </w:p>
         </w:tc>
       </w:tr>
       <w:tr>
+        <w:tblPrEx>
+          <w:tblBorders>
+            <w:top w:val="single" w:color="auto" w:sz="4" w:space="0"/>
+            <w:left w:val="single" w:color="auto" w:sz="4" w:space="0"/>
+            <w:bottom w:val="single" w:color="auto" w:sz="4" w:space="0"/>
+            <w:right w:val="single" w:color="auto" w:sz="4" w:space="0"/>
+            <w:insideH w:val="single" w:color="auto" w:sz="4" w:space="0"/>
+            <w:insideV w:val="single" w:color="auto" w:sz="4" w:space="0"/>
+          </w:tblBorders>
+          <w:tblCellMar>
+            <w:top w:w="0" w:type="dxa"/>
+            <w:left w:w="108" w:type="dxa"/>
+            <w:bottom w:w="0" w:type="dxa"/>
+            <w:right w:w="108" w:type="dxa"/>
+          </w:tblCellMar>
+        </w:tblPrEx>
         <w:trPr>
-          <w:trHeight w:val="338"/>
+          <w:trHeight w:val="338" w:hRule="atLeast"/>
         </w:trPr>
         <w:tc>
           <w:tcPr>
@@ -509,18 +821,35 @@
             </w:pPr>
             <w:r>
               <w:rPr>
-                <w:rFonts w:ascii="Bookman Old Style" w:hAnsi="Bookman Old Style"/>
+                <w:rFonts w:hint="default" w:ascii="Bookman Old Style" w:hAnsi="Bookman Old Style"/>
                 <w:b/>
                 <w:sz w:val="24"/>
-              </w:rPr>
-              <w:t>FAMILY BACKGROUND</w:t>
+                <w:lang w:val="en-US"/>
+              </w:rPr>
+              <w:t xml:space="preserve"> </w:t>
             </w:r>
           </w:p>
         </w:tc>
       </w:tr>
       <w:tr>
+        <w:tblPrEx>
+          <w:tblBorders>
+            <w:top w:val="single" w:color="auto" w:sz="4" w:space="0"/>
+            <w:left w:val="single" w:color="auto" w:sz="4" w:space="0"/>
+            <w:bottom w:val="single" w:color="auto" w:sz="4" w:space="0"/>
+            <w:right w:val="single" w:color="auto" w:sz="4" w:space="0"/>
+            <w:insideH w:val="single" w:color="auto" w:sz="4" w:space="0"/>
+            <w:insideV w:val="single" w:color="auto" w:sz="4" w:space="0"/>
+          </w:tblBorders>
+          <w:tblCellMar>
+            <w:top w:w="0" w:type="dxa"/>
+            <w:left w:w="108" w:type="dxa"/>
+            <w:bottom w:w="0" w:type="dxa"/>
+            <w:right w:w="108" w:type="dxa"/>
+          </w:tblCellMar>
+        </w:tblPrEx>
         <w:trPr>
-          <w:trHeight w:val="338"/>
+          <w:trHeight w:val="338" w:hRule="atLeast"/>
         </w:trPr>
         <w:tc>
           <w:tcPr>
@@ -539,7 +868,38 @@
               <w:rPr>
                 <w:rFonts w:ascii="Bookman Old Style" w:hAnsi="Bookman Old Style"/>
               </w:rPr>
-              <w:t xml:space="preserve">Father’s Name: ________________________________________  Occupation: _______________________  </w:t>
+              <w:t xml:space="preserve">Father’s Name: </w:t>
+            </w:r>
+            <w:r>
+              <w:rPr>
+                <w:rFonts w:ascii="SimSun" w:hAnsi="SimSun" w:eastAsia="SimSun" w:cs="SimSun"/>
+                <w:sz w:val="24"/>
+                <w:szCs w:val="24"/>
+              </w:rPr>
+              <w:t>{fatherName}</w:t>
+            </w:r>
+            <w:r>
+              <w:rPr>
+                <w:rFonts w:hint="default" w:ascii="SimSun" w:hAnsi="SimSun" w:eastAsia="SimSun" w:cs="SimSun"/>
+                <w:sz w:val="24"/>
+                <w:szCs w:val="24"/>
+                <w:lang w:val="en-US"/>
+              </w:rPr>
+              <w:t xml:space="preserve">                        </w:t>
+            </w:r>
+            <w:r>
+              <w:rPr>
+                <w:rFonts w:ascii="Bookman Old Style" w:hAnsi="Bookman Old Style"/>
+              </w:rPr>
+              <w:t xml:space="preserve">  Occupation: </w:t>
+            </w:r>
+            <w:r>
+              <w:rPr>
+                <w:rFonts w:ascii="SimSun" w:hAnsi="SimSun" w:eastAsia="SimSun" w:cs="SimSun"/>
+                <w:sz w:val="24"/>
+                <w:szCs w:val="24"/>
+              </w:rPr>
+              <w:t>{fatherOccupation}</w:t>
             </w:r>
           </w:p>
           <w:p>
@@ -553,7 +913,15 @@
               <w:rPr>
                 <w:rFonts w:ascii="Bookman Old Style" w:hAnsi="Bookman Old Style"/>
               </w:rPr>
-              <w:t>Contact Number: ________________________</w:t>
+              <w:t>Contact Number:</w:t>
+            </w:r>
+            <w:r>
+              <w:rPr>
+                <w:rFonts w:ascii="SimSun" w:hAnsi="SimSun" w:eastAsia="SimSun" w:cs="SimSun"/>
+                <w:sz w:val="24"/>
+                <w:szCs w:val="24"/>
+              </w:rPr>
+              <w:t>{fatherContact}</w:t>
             </w:r>
           </w:p>
           <w:p>
@@ -567,21 +935,68 @@
               <w:rPr>
                 <w:rFonts w:ascii="Bookman Old Style" w:hAnsi="Bookman Old Style"/>
               </w:rPr>
-              <w:t>Mother’s Maiden Name: ________________________________  Occupation: _______________________</w:t>
+              <w:t xml:space="preserve">Mother’s Maiden Name: </w:t>
+            </w:r>
+            <w:r>
+              <w:rPr>
+                <w:rFonts w:ascii="SimSun" w:hAnsi="SimSun" w:eastAsia="SimSun" w:cs="SimSun"/>
+                <w:sz w:val="24"/>
+                <w:szCs w:val="24"/>
+              </w:rPr>
+              <w:t>{motherName}</w:t>
+            </w:r>
+            <w:r>
+              <w:rPr>
+                <w:rFonts w:hint="default" w:ascii="SimSun" w:hAnsi="SimSun" w:eastAsia="SimSun" w:cs="SimSun"/>
+                <w:sz w:val="24"/>
+                <w:szCs w:val="24"/>
+                <w:lang w:val="en-US"/>
+              </w:rPr>
+              <w:t xml:space="preserve">                 </w:t>
+            </w:r>
+            <w:r>
+              <w:rPr>
+                <w:rFonts w:ascii="Bookman Old Style" w:hAnsi="Bookman Old Style"/>
+              </w:rPr>
+              <w:t xml:space="preserve">  Occupation: </w:t>
+            </w:r>
+            <w:r>
+              <w:rPr>
+                <w:rFonts w:ascii="SimSun" w:hAnsi="SimSun" w:eastAsia="SimSun" w:cs="SimSun"/>
+                <w:sz w:val="24"/>
+                <w:szCs w:val="24"/>
+              </w:rPr>
+              <w:t>{motherOccupation}</w:t>
             </w:r>
           </w:p>
           <w:p>
             <w:pPr>
               <w:spacing w:before="120" w:after="0" w:line="240" w:lineRule="auto"/>
               <w:rPr>
-                <w:rFonts w:ascii="Bookman Old Style" w:hAnsi="Bookman Old Style"/>
+                <w:rFonts w:hint="default" w:ascii="Bookman Old Style" w:hAnsi="Bookman Old Style"/>
+                <w:lang w:val="en-US"/>
               </w:rPr>
             </w:pPr>
             <w:r>
               <w:rPr>
                 <w:rFonts w:ascii="Bookman Old Style" w:hAnsi="Bookman Old Style"/>
               </w:rPr>
-              <w:t>Contact Number: ________________________</w:t>
+              <w:t>Contact Number:</w:t>
+            </w:r>
+            <w:r>
+              <w:rPr>
+                <w:rFonts w:hint="default" w:ascii="Bookman Old Style" w:hAnsi="Bookman Old Style"/>
+                <w:lang w:val="en-US"/>
+              </w:rPr>
+              <w:t xml:space="preserve"> </w:t>
+            </w:r>
+            <w:r>
+              <w:rPr>
+                <w:rFonts w:ascii="SimSun" w:hAnsi="SimSun" w:eastAsia="SimSun" w:cs="SimSun"/>
+                <w:sz w:val="24"/>
+                <w:szCs w:val="24"/>
+              </w:rPr>
+              <w:t>{motherContact}</w:t>
             </w:r>
           </w:p>
           <w:p>
@@ -595,14 +1010,38 @@
               <w:rPr>
                 <w:rFonts w:ascii="Bookman Old Style" w:hAnsi="Bookman Old Style"/>
               </w:rPr>
-              <w:t>Total Family Monthly Income: ____________________</w:t>
+              <w:t xml:space="preserve">Total Family Monthly Income: </w:t>
+            </w:r>
+            <w:r>
+              <w:rPr>
+                <w:rFonts w:ascii="SimSun" w:hAnsi="SimSun" w:eastAsia="SimSun" w:cs="SimSun"/>
+                <w:sz w:val="24"/>
+                <w:szCs w:val="24"/>
+              </w:rPr>
+              <w:t>{familyIncome}</w:t>
             </w:r>
           </w:p>
         </w:tc>
       </w:tr>
       <w:tr>
+        <w:tblPrEx>
+          <w:tblBorders>
+            <w:top w:val="single" w:color="auto" w:sz="4" w:space="0"/>
+            <w:left w:val="single" w:color="auto" w:sz="4" w:space="0"/>
+            <w:bottom w:val="single" w:color="auto" w:sz="4" w:space="0"/>
+            <w:right w:val="single" w:color="auto" w:sz="4" w:space="0"/>
+            <w:insideH w:val="single" w:color="auto" w:sz="4" w:space="0"/>
+            <w:insideV w:val="single" w:color="auto" w:sz="4" w:space="0"/>
+          </w:tblBorders>
+          <w:tblCellMar>
+            <w:top w:w="0" w:type="dxa"/>
+            <w:left w:w="108" w:type="dxa"/>
+            <w:bottom w:w="0" w:type="dxa"/>
+            <w:right w:w="108" w:type="dxa"/>
+          </w:tblCellMar>
+        </w:tblPrEx>
         <w:trPr>
-          <w:trHeight w:val="338"/>
+          <w:trHeight w:val="338" w:hRule="atLeast"/>
         </w:trPr>
         <w:tc>
           <w:tcPr>
@@ -631,8 +1070,24 @@
         </w:tc>
       </w:tr>
       <w:tr>
+        <w:tblPrEx>
+          <w:tblBorders>
+            <w:top w:val="single" w:color="auto" w:sz="4" w:space="0"/>
+            <w:left w:val="single" w:color="auto" w:sz="4" w:space="0"/>
+            <w:bottom w:val="single" w:color="auto" w:sz="4" w:space="0"/>
+            <w:right w:val="single" w:color="auto" w:sz="4" w:space="0"/>
+            <w:insideH w:val="single" w:color="auto" w:sz="4" w:space="0"/>
+            <w:insideV w:val="single" w:color="auto" w:sz="4" w:space="0"/>
+          </w:tblBorders>
+          <w:tblCellMar>
+            <w:top w:w="0" w:type="dxa"/>
+            <w:left w:w="108" w:type="dxa"/>
+            <w:bottom w:w="0" w:type="dxa"/>
+            <w:right w:w="108" w:type="dxa"/>
+          </w:tblCellMar>
+        </w:tblPrEx>
         <w:trPr>
-          <w:trHeight w:val="338"/>
+          <w:trHeight w:val="338" w:hRule="atLeast"/>
         </w:trPr>
         <w:tc>
           <w:tcPr>
@@ -651,21 +1106,115 @@
               <w:rPr>
                 <w:rFonts w:ascii="Bookman Old Style" w:hAnsi="Bookman Old Style"/>
               </w:rPr>
-              <w:t>Elementary: _________________________________________________  Year Graduated: _____________</w:t>
+              <w:t xml:space="preserve">Elementary: </w:t>
+            </w:r>
+            <w:r>
+              <w:rPr>
+                <w:rFonts w:ascii="SimSun" w:hAnsi="SimSun" w:eastAsia="SimSun" w:cs="SimSun"/>
+                <w:sz w:val="24"/>
+                <w:szCs w:val="24"/>
+              </w:rPr>
+              <w:t>{elemSchool}</w:t>
+            </w:r>
+            <w:r>
+              <w:rPr>
+                <w:rFonts w:hint="default" w:ascii="SimSun" w:hAnsi="SimSun" w:eastAsia="SimSun" w:cs="SimSun"/>
+                <w:sz w:val="24"/>
+                <w:szCs w:val="24"/>
+                <w:lang w:val="en-US"/>
+              </w:rPr>
+              <w:t xml:space="preserve">                                </w:t>
+            </w:r>
+            <w:r>
+              <w:rPr>
+                <w:rFonts w:ascii="Bookman Old Style" w:hAnsi="Bookman Old Style"/>
+              </w:rPr>
+              <w:t xml:space="preserve"> </w:t>
+            </w:r>
+            <w:r>
+              <w:rPr>
+                <w:rFonts w:hint="default" w:ascii="Bookman Old Style" w:hAnsi="Bookman Old Style"/>
+                <w:lang w:val="en-US"/>
+              </w:rPr>
+              <w:t xml:space="preserve"> </w:t>
+            </w:r>
+            <w:r>
+              <w:rPr>
+                <w:rFonts w:ascii="Bookman Old Style" w:hAnsi="Bookman Old Style"/>
+              </w:rPr>
+              <w:t xml:space="preserve">Year Graduated: </w:t>
+            </w:r>
+            <w:r>
+              <w:rPr>
+                <w:rFonts w:ascii="SimSun" w:hAnsi="SimSun" w:eastAsia="SimSun" w:cs="SimSun"/>
+                <w:sz w:val="24"/>
+                <w:szCs w:val="24"/>
+              </w:rPr>
+              <w:t>{elemYear}</w:t>
             </w:r>
           </w:p>
           <w:p>
             <w:pPr>
               <w:spacing w:after="0" w:line="240" w:lineRule="auto"/>
               <w:rPr>
-                <w:rFonts w:ascii="Bookman Old Style" w:hAnsi="Bookman Old Style"/>
+                <w:rFonts w:hint="default" w:ascii="Bookman Old Style" w:hAnsi="Bookman Old Style"/>
+                <w:lang w:val="en-US"/>
               </w:rPr>
             </w:pPr>
             <w:r>
               <w:rPr>
                 <w:rFonts w:ascii="Bookman Old Style" w:hAnsi="Bookman Old Style"/>
               </w:rPr>
-              <w:t>High School: _________________________________________________  Year Graduated: _____________</w:t>
+              <w:t>High School:</w:t>
+            </w:r>
+            <w:r>
+              <w:rPr>
+                <w:rFonts w:hint="default" w:ascii="Bookman Old Style" w:hAnsi="Bookman Old Style"/>
+                <w:lang w:val="en-US"/>
+              </w:rPr>
+              <w:t xml:space="preserve"> </w:t>
+            </w:r>
+            <w:r>
+              <w:rPr>
+                <w:rFonts w:ascii="SimSun" w:hAnsi="SimSun" w:eastAsia="SimSun" w:cs="SimSun"/>
+                <w:sz w:val="24"/>
+                <w:szCs w:val="24"/>
+              </w:rPr>
+              <w:t>{hsSchool}</w:t>
+            </w:r>
+            <w:r>
+              <w:rPr>
+                <w:rFonts w:ascii="Bookman Old Style" w:hAnsi="Bookman Old Style"/>
+              </w:rPr>
+              <w:t xml:space="preserve"> </w:t>
+            </w:r>
+            <w:r>
+              <w:rPr>
+                <w:rFonts w:hint="default" w:ascii="Bookman Old Style" w:hAnsi="Bookman Old Style"/>
+                <w:lang w:val="en-US"/>
+              </w:rPr>
+              <w:t xml:space="preserve">                                                          </w:t>
+            </w:r>
+            <w:r>
+              <w:rPr>
+                <w:rFonts w:ascii="Bookman Old Style" w:hAnsi="Bookman Old Style"/>
+              </w:rPr>
+              <w:t>Year Graduated:</w:t>
+            </w:r>
+            <w:r>
+              <w:rPr>
+                <w:rFonts w:hint="default" w:ascii="Bookman Old Style" w:hAnsi="Bookman Old Style"/>
+                <w:lang w:val="en-US"/>
+              </w:rPr>
+              <w:t xml:space="preserve"> </w:t>
+            </w:r>
+            <w:r>
+              <w:rPr>
+                <w:rFonts w:ascii="SimSun" w:hAnsi="SimSun" w:eastAsia="SimSun" w:cs="SimSun"/>
+                <w:sz w:val="24"/>
+                <w:szCs w:val="24"/>
+              </w:rPr>
+              <w:t>{hsYear}</w:t>
             </w:r>
           </w:p>
           <w:p>
@@ -679,7 +1228,42 @@
               <w:rPr>
                 <w:rFonts w:ascii="Bookman Old Style" w:hAnsi="Bookman Old Style"/>
               </w:rPr>
-              <w:t>College: ______________________________________________________  Year Graduated: ____________</w:t>
+              <w:t xml:space="preserve">College: </w:t>
+            </w:r>
+            <w:r>
+              <w:rPr>
+                <w:rFonts w:ascii="SimSun" w:hAnsi="SimSun" w:eastAsia="SimSun" w:cs="SimSun"/>
+                <w:sz w:val="24"/>
+                <w:szCs w:val="24"/>
+              </w:rPr>
+              <w:t>{collegeSchool}</w:t>
+            </w:r>
+            <w:r>
+              <w:rPr>
+                <w:rFonts w:ascii="Bookman Old Style" w:hAnsi="Bookman Old Style"/>
+              </w:rPr>
+              <w:t xml:space="preserve">  </w:t>
+            </w:r>
+            <w:r>
+              <w:rPr>
+                <w:rFonts w:hint="default" w:ascii="Bookman Old Style" w:hAnsi="Bookman Old Style"/>
+                <w:lang w:val="en-US"/>
+              </w:rPr>
+              <w:t xml:space="preserve">                                                        </w:t>
+            </w:r>
+            <w:r>
+              <w:rPr>
+                <w:rFonts w:ascii="Bookman Old Style" w:hAnsi="Bookman Old Style"/>
+              </w:rPr>
+              <w:t xml:space="preserve">Year Graduated: </w:t>
+            </w:r>
+            <w:r>
+              <w:rPr>
+                <w:rFonts w:ascii="SimSun" w:hAnsi="SimSun" w:eastAsia="SimSun" w:cs="SimSun"/>
+                <w:sz w:val="24"/>
+                <w:szCs w:val="24"/>
+              </w:rPr>
+              <w:t>{collegeYear}</w:t>
             </w:r>
           </w:p>
           <w:p>
@@ -693,7 +1277,42 @@
               <w:rPr>
                 <w:rFonts w:ascii="Bookman Old Style" w:hAnsi="Bookman Old Style"/>
               </w:rPr>
-              <w:t>Vocational: ___________________________________________________  Year Graduated: ____________</w:t>
+              <w:t xml:space="preserve">Vocational: </w:t>
+            </w:r>
+            <w:r>
+              <w:rPr>
+                <w:rFonts w:ascii="SimSun" w:hAnsi="SimSun" w:eastAsia="SimSun" w:cs="SimSun"/>
+                <w:sz w:val="24"/>
+                <w:szCs w:val="24"/>
+              </w:rPr>
+              <w:t>{vocSchool}</w:t>
+            </w:r>
+            <w:r>
+              <w:rPr>
+                <w:rFonts w:ascii="Bookman Old Style" w:hAnsi="Bookman Old Style"/>
+              </w:rPr>
+              <w:t xml:space="preserve">  </w:t>
+            </w:r>
+            <w:r>
+              <w:rPr>
+                <w:rFonts w:hint="default" w:ascii="Bookman Old Style" w:hAnsi="Bookman Old Style"/>
+                <w:lang w:val="en-US"/>
+              </w:rPr>
+              <w:t xml:space="preserve">                                                          </w:t>
+            </w:r>
+            <w:r>
+              <w:rPr>
+                <w:rFonts w:ascii="Bookman Old Style" w:hAnsi="Bookman Old Style"/>
+              </w:rPr>
+              <w:t>Year Graduated:</w:t>
+            </w:r>
+            <w:r>
+              <w:rPr>
+                <w:rFonts w:ascii="SimSun" w:hAnsi="SimSun" w:eastAsia="SimSun" w:cs="SimSun"/>
+                <w:sz w:val="24"/>
+                <w:szCs w:val="24"/>
+              </w:rPr>
+              <w:t>{vocYear}</w:t>
             </w:r>
           </w:p>
         </w:tc>
@@ -801,6 +1420,13 @@
           <w:szCs w:val="24"/>
         </w:rPr>
         <w:tab/>
+      </w:r>
+      <w:r>
+        <w:rPr>
+          <w:rFonts w:ascii="Times New Roman" w:hAnsi="Times New Roman" w:cs="Times New Roman"/>
+          <w:sz w:val="24"/>
+          <w:szCs w:val="24"/>
+        </w:rPr>
         <w:t>Verified by:</w:t>
       </w:r>
     </w:p>
@@ -862,6 +1488,13 @@
           <w:szCs w:val="24"/>
         </w:rPr>
         <w:tab/>
+      </w:r>
+      <w:r>
+        <w:rPr>
+          <w:rFonts w:ascii="Times New Roman" w:hAnsi="Times New Roman" w:cs="Times New Roman"/>
+          <w:sz w:val="24"/>
+          <w:szCs w:val="24"/>
+        </w:rPr>
         <w:t>_________________________________</w:t>
       </w:r>
     </w:p>
@@ -878,7 +1511,6 @@
           <w:rFonts w:ascii="Times New Roman" w:hAnsi="Times New Roman" w:cs="Times New Roman"/>
           <w:szCs w:val="24"/>
         </w:rPr>
-        <w:lastRenderedPageBreak/>
         <w:t xml:space="preserve"> Signature over Printed Name of Applicant</w:t>
       </w:r>
       <w:r>
@@ -908,6 +1540,12 @@
           <w:szCs w:val="24"/>
         </w:rPr>
         <w:tab/>
+      </w:r>
+      <w:r>
+        <w:rPr>
+          <w:rFonts w:ascii="Times New Roman" w:hAnsi="Times New Roman" w:cs="Times New Roman"/>
+          <w:szCs w:val="24"/>
+        </w:rPr>
         <w:t xml:space="preserve"> Signature over Printed Name of SK Official</w:t>
       </w:r>
     </w:p>
@@ -929,11 +1567,11 @@
       </w:r>
       <w:r>
         <w:rPr>
-          <w:rFonts w:ascii="Times New Roman" w:hAnsi="Times New Roman" w:cs="Times New Roman"/>
+          <w:rFonts w:ascii="SimSun" w:hAnsi="SimSun" w:eastAsia="SimSun" w:cs="SimSun"/>
           <w:sz w:val="24"/>
           <w:szCs w:val="24"/>
         </w:rPr>
-        <w:t>________________</w:t>
+        <w:t>{submissionDate}</w:t>
       </w:r>
       <w:r>
         <w:rPr>
@@ -966,7 +1604,14 @@
           <w:szCs w:val="24"/>
         </w:rPr>
         <w:tab/>
-        <w:t xml:space="preserve">         </w:t>
+      </w:r>
+      <w:r>
+        <w:rPr>
+          <w:rFonts w:ascii="Times New Roman" w:hAnsi="Times New Roman" w:cs="Times New Roman"/>
+          <w:sz w:val="24"/>
+          <w:szCs w:val="24"/>
+        </w:rPr>
+        <w:t xml:space="preserve">  </w:t>
       </w:r>
       <w:r>
         <w:rPr>
@@ -985,38 +1630,38 @@
       </w:r>
     </w:p>
     <w:sectPr>
-      <w:headerReference w:type="even" r:id="rId7"/>
-      <w:headerReference w:type="default" r:id="rId8"/>
-      <w:footerReference w:type="even" r:id="rId9"/>
-      <w:footerReference w:type="default" r:id="rId10"/>
-      <w:headerReference w:type="first" r:id="rId11"/>
-      <w:footerReference w:type="first" r:id="rId12"/>
+      <w:headerReference r:id="rId7" w:type="first"/>
+      <w:footerReference r:id="rId10" w:type="first"/>
+      <w:headerReference r:id="rId5" w:type="default"/>
+      <w:footerReference r:id="rId8" w:type="default"/>
+      <w:headerReference r:id="rId6" w:type="even"/>
+      <w:footerReference r:id="rId9" w:type="even"/>
       <w:pgSz w:w="11906" w:h="16838"/>
       <w:pgMar w:top="720" w:right="720" w:bottom="432" w:left="720" w:header="720" w:footer="720" w:gutter="0"/>
       <w:paperSrc w:first="15" w:other="15"/>
-      <w:cols w:space="720"/>
-      <w:docGrid w:linePitch="360"/>
+      <w:cols w:space="720" w:num="1"/>
+      <w:docGrid w:linePitch="360" w:charSpace="0"/>
     </w:sectPr>
   </w:body>
 </w:document>
 </file>
 
 <file path=word/endnotes.xml><?xml version="1.0" encoding="utf-8"?>
-<w:endnotes xmlns:wpc="http://schemas.microsoft.com/office/word/2010/wordprocessingCanvas" xmlns:cx="http://schemas.microsoft.com/office/drawing/2014/chartex" xmlns:cx1="http://schemas.microsoft.com/office/drawing/2015/9/8/chartex" xmlns:cx2="http://schemas.microsoft.com/office/drawing/2015/10/21/chartex" xmlns:cx3="http://schemas.microsoft.com/office/drawing/2016/5/9/chartex" xmlns:cx4="http://schemas.microsoft.com/office/drawing/2016/5/10/chartex" xmlns:cx5="http://schemas.microsoft.com/office/drawing/2016/5/11/chartex" xmlns:cx6="http://schemas.microsoft.com/office/drawing/2016/5/12/chartex" xmlns:cx7="http://schemas.microsoft.com/office/drawing/2016/5/13/chartex" xmlns:cx8="http://schemas.microsoft.com/office/drawing/2016/5/14/chartex" xmlns:mc="http://schemas.openxmlformats.org/markup-compatibility/2006" xmlns:aink="http://schemas.microsoft.com/office/drawing/2016/ink" xmlns:am3d="http://schemas.microsoft.com/office/drawing/2017/model3d" xmlns:o="urn:schemas-microsoft-com:office:office" xmlns:oel="http://schemas.microsoft.com/office/2019/extlst" xmlns:r="http://schemas.openxmlformats.org/officeDocument/2006/relationships" xmlns:m="http://schemas.openxmlformats.org/officeDocument/2006/math" xmlns:v="urn:schemas-microsoft-com:vml" xmlns:wp14="http://schemas.microsoft.com/office/word/2010/wordprocessingDrawing" xmlns:wp="http://schemas.openxmlformats.org/drawingml/2006/wordprocessingDrawing" xmlns:w10="urn:schemas-microsoft-com:office:word" xmlns:w="http://schemas.openxmlformats.org/wordprocessingml/2006/main" xmlns:w14="http://schemas.microsoft.com/office/word/2010/wordml" xmlns:w15="http://schemas.microsoft.com/office/word/2012/wordml" xmlns:w16cex="http://schemas.microsoft.com/office/word/2018/wordml/cex" xmlns:w16cid="http://schemas.microsoft.com/office/word/2016/wordml/cid" xmlns:w16="http://schemas.microsoft.com/office/word/2018/wordml" xmlns:w16du="http://schemas.microsoft.com/office/word/2023/wordml/word16du" xmlns:w16sdtdh="http://schemas.microsoft.com/office/word/2020/wordml/sdtdatahash" xmlns:w16se="http://schemas.microsoft.com/office/word/2015/wordml/symex" xmlns:wpg="http://schemas.microsoft.com/office/word/2010/wordprocessingGroup" xmlns:wpi="http://schemas.microsoft.com/office/word/2010/wordprocessingInk" xmlns:wne="http://schemas.microsoft.com/office/word/2006/wordml" xmlns:wps="http://schemas.microsoft.com/office/word/2010/wordprocessingShape" mc:Ignorable="w14 w15 w16se w16cid w16 w16cex w16sdtdh w16du wp14">
-  <w:endnote w:type="separator" w:id="-1">
+<w:endnotes xmlns:wpc="http://schemas.microsoft.com/office/word/2010/wordprocessingCanvas" xmlns:mc="http://schemas.openxmlformats.org/markup-compatibility/2006" xmlns:o="urn:schemas-microsoft-com:office:office" xmlns:r="http://schemas.openxmlformats.org/officeDocument/2006/relationships" xmlns:m="http://schemas.openxmlformats.org/officeDocument/2006/math" xmlns:v="urn:schemas-microsoft-com:vml" xmlns:wp14="http://schemas.microsoft.com/office/word/2010/wordprocessingDrawing" xmlns:wp="http://schemas.openxmlformats.org/drawingml/2006/wordprocessingDrawing" xmlns:w="http://schemas.openxmlformats.org/wordprocessingml/2006/main" xmlns:w14="http://schemas.microsoft.com/office/word/2010/wordml" xmlns:w15="http://schemas.microsoft.com/office/word/2012/wordml" xmlns:w10="urn:schemas-microsoft-com:office:word" xmlns:wpg="http://schemas.microsoft.com/office/word/2010/wordprocessingGroup" xmlns:wpi="http://schemas.microsoft.com/office/word/2010/wordprocessingInk" xmlns:wne="http://schemas.microsoft.com/office/word/2006/wordml" xmlns:wps="http://schemas.microsoft.com/office/word/2010/wordprocessingShape" xmlns:wpsCustomData="http://www.wps.cn/officeDocument/2013/wpsCustomData" mc:Ignorable="w14 w15 wp14">
+  <w:endnote w:type="separator" w:id="0">
     <w:p>
       <w:pPr>
-        <w:spacing w:after="0" w:line="240" w:lineRule="auto"/>
+        <w:spacing w:line="240" w:lineRule="auto"/>
       </w:pPr>
       <w:r>
         <w:separator/>
       </w:r>
     </w:p>
   </w:endnote>
-  <w:endnote w:type="continuationSeparator" w:id="0">
+  <w:endnote w:type="continuationSeparator" w:id="1">
     <w:p>
       <w:pPr>
-        <w:spacing w:after="0" w:line="240" w:lineRule="auto"/>
+        <w:spacing w:line="240" w:lineRule="auto"/>
       </w:pPr>
       <w:r>
         <w:continuationSeparator/>
@@ -1027,51 +1672,51 @@
 </file>
 
 <file path=word/footer1.xml><?xml version="1.0" encoding="utf-8"?>
-<w:ftr xmlns:wpc="http://schemas.microsoft.com/office/word/2010/wordprocessingCanvas" xmlns:cx="http://schemas.microsoft.com/office/drawing/2014/chartex" xmlns:cx1="http://schemas.microsoft.com/office/drawing/2015/9/8/chartex" xmlns:cx2="http://schemas.microsoft.com/office/drawing/2015/10/21/chartex" xmlns:cx3="http://schemas.microsoft.com/office/drawing/2016/5/9/chartex" xmlns:cx4="http://schemas.microsoft.com/office/drawing/2016/5/10/chartex" xmlns:cx5="http://schemas.microsoft.com/office/drawing/2016/5/11/chartex" xmlns:cx6="http://schemas.microsoft.com/office/drawing/2016/5/12/chartex" xmlns:cx7="http://schemas.microsoft.com/office/drawing/2016/5/13/chartex" xmlns:cx8="http://schemas.microsoft.com/office/drawing/2016/5/14/chartex" xmlns:mc="http://schemas.openxmlformats.org/markup-compatibility/2006" xmlns:aink="http://schemas.microsoft.com/office/drawing/2016/ink" xmlns:am3d="http://schemas.microsoft.com/office/drawing/2017/model3d" xmlns:o="urn:schemas-microsoft-com:office:office" xmlns:oel="http://schemas.microsoft.com/office/2019/extlst" xmlns:r="http://schemas.openxmlformats.org/officeDocument/2006/relationships" xmlns:m="http://schemas.openxmlformats.org/officeDocument/2006/math" xmlns:v="urn:schemas-microsoft-com:vml" xmlns:wp14="http://schemas.microsoft.com/office/word/2010/wordprocessingDrawing" xmlns:wp="http://schemas.openxmlformats.org/drawingml/2006/wordprocessingDrawing" xmlns:w10="urn:schemas-microsoft-com:office:word" xmlns:w="http://schemas.openxmlformats.org/wordprocessingml/2006/main" xmlns:w14="http://schemas.microsoft.com/office/word/2010/wordml" xmlns:w15="http://schemas.microsoft.com/office/word/2012/wordml" xmlns:w16cex="http://schemas.microsoft.com/office/word/2018/wordml/cex" xmlns:w16cid="http://schemas.microsoft.com/office/word/2016/wordml/cid" xmlns:w16="http://schemas.microsoft.com/office/word/2018/wordml" xmlns:w16du="http://schemas.microsoft.com/office/word/2023/wordml/word16du" xmlns:w16sdtdh="http://schemas.microsoft.com/office/word/2020/wordml/sdtdatahash" xmlns:w16se="http://schemas.microsoft.com/office/word/2015/wordml/symex" xmlns:wpg="http://schemas.microsoft.com/office/word/2010/wordprocessingGroup" xmlns:wpi="http://schemas.microsoft.com/office/word/2010/wordprocessingInk" xmlns:wne="http://schemas.microsoft.com/office/word/2006/wordml" xmlns:wps="http://schemas.microsoft.com/office/word/2010/wordprocessingShape" mc:Ignorable="w14 w15 w16se w16cid w16 w16cex w16sdtdh w16du wp14">
+<w:ftr xmlns:wpc="http://schemas.microsoft.com/office/word/2010/wordprocessingCanvas" xmlns:mc="http://schemas.openxmlformats.org/markup-compatibility/2006" xmlns:o="urn:schemas-microsoft-com:office:office" xmlns:r="http://schemas.openxmlformats.org/officeDocument/2006/relationships" xmlns:m="http://schemas.openxmlformats.org/officeDocument/2006/math" xmlns:v="urn:schemas-microsoft-com:vml" xmlns:wp14="http://schemas.microsoft.com/office/word/2010/wordprocessingDrawing" xmlns:wp="http://schemas.openxmlformats.org/drawingml/2006/wordprocessingDrawing" xmlns:w10="urn:schemas-microsoft-com:office:word" xmlns:w="http://schemas.openxmlformats.org/wordprocessingml/2006/main" xmlns:w14="http://schemas.microsoft.com/office/word/2010/wordml" xmlns:w15="http://schemas.microsoft.com/office/word/2012/wordml" xmlns:wpg="http://schemas.microsoft.com/office/word/2010/wordprocessingGroup" xmlns:wpi="http://schemas.microsoft.com/office/word/2010/wordprocessingInk" xmlns:wne="http://schemas.microsoft.com/office/word/2006/wordml" xmlns:wps="http://schemas.microsoft.com/office/word/2010/wordprocessingShape" xmlns:wpsCustomData="http://www.wps.cn/officeDocument/2013/wpsCustomData" mc:Ignorable="w14 w15 wp14">
   <w:p>
     <w:pPr>
-      <w:pStyle w:val="Footer"/>
+      <w:pStyle w:val="5"/>
     </w:pPr>
   </w:p>
 </w:ftr>
 </file>
 
 <file path=word/footer2.xml><?xml version="1.0" encoding="utf-8"?>
-<w:ftr xmlns:wpc="http://schemas.microsoft.com/office/word/2010/wordprocessingCanvas" xmlns:cx="http://schemas.microsoft.com/office/drawing/2014/chartex" xmlns:cx1="http://schemas.microsoft.com/office/drawing/2015/9/8/chartex" xmlns:cx2="http://schemas.microsoft.com/office/drawing/2015/10/21/chartex" xmlns:cx3="http://schemas.microsoft.com/office/drawing/2016/5/9/chartex" xmlns:cx4="http://schemas.microsoft.com/office/drawing/2016/5/10/chartex" xmlns:cx5="http://schemas.microsoft.com/office/drawing/2016/5/11/chartex" xmlns:cx6="http://schemas.microsoft.com/office/drawing/2016/5/12/chartex" xmlns:cx7="http://schemas.microsoft.com/office/drawing/2016/5/13/chartex" xmlns:cx8="http://schemas.microsoft.com/office/drawing/2016/5/14/chartex" xmlns:mc="http://schemas.openxmlformats.org/markup-compatibility/2006" xmlns:aink="http://schemas.microsoft.com/office/drawing/2016/ink" xmlns:am3d="http://schemas.microsoft.com/office/drawing/2017/model3d" xmlns:o="urn:schemas-microsoft-com:office:office" xmlns:oel="http://schemas.microsoft.com/office/2019/extlst" xmlns:r="http://schemas.openxmlformats.org/officeDocument/2006/relationships" xmlns:m="http://schemas.openxmlformats.org/officeDocument/2006/math" xmlns:v="urn:schemas-microsoft-com:vml" xmlns:wp14="http://schemas.microsoft.com/office/word/2010/wordprocessingDrawing" xmlns:wp="http://schemas.openxmlformats.org/drawingml/2006/wordprocessingDrawing" xmlns:w10="urn:schemas-microsoft-com:office:word" xmlns:w="http://schemas.openxmlformats.org/wordprocessingml/2006/main" xmlns:w14="http://schemas.microsoft.com/office/word/2010/wordml" xmlns:w15="http://schemas.microsoft.com/office/word/2012/wordml" xmlns:w16cex="http://schemas.microsoft.com/office/word/2018/wordml/cex" xmlns:w16cid="http://schemas.microsoft.com/office/word/2016/wordml/cid" xmlns:w16="http://schemas.microsoft.com/office/word/2018/wordml" xmlns:w16du="http://schemas.microsoft.com/office/word/2023/wordml/word16du" xmlns:w16sdtdh="http://schemas.microsoft.com/office/word/2020/wordml/sdtdatahash" xmlns:w16se="http://schemas.microsoft.com/office/word/2015/wordml/symex" xmlns:wpg="http://schemas.microsoft.com/office/word/2010/wordprocessingGroup" xmlns:wpi="http://schemas.microsoft.com/office/word/2010/wordprocessingInk" xmlns:wne="http://schemas.microsoft.com/office/word/2006/wordml" xmlns:wps="http://schemas.microsoft.com/office/word/2010/wordprocessingShape" mc:Ignorable="w14 w15 w16se w16cid w16 w16cex w16sdtdh w16du wp14">
+<w:ftr xmlns:wpc="http://schemas.microsoft.com/office/word/2010/wordprocessingCanvas" xmlns:mc="http://schemas.openxmlformats.org/markup-compatibility/2006" xmlns:o="urn:schemas-microsoft-com:office:office" xmlns:r="http://schemas.openxmlformats.org/officeDocument/2006/relationships" xmlns:m="http://schemas.openxmlformats.org/officeDocument/2006/math" xmlns:v="urn:schemas-microsoft-com:vml" xmlns:wp14="http://schemas.microsoft.com/office/word/2010/wordprocessingDrawing" xmlns:wp="http://schemas.openxmlformats.org/drawingml/2006/wordprocessingDrawing" xmlns:w10="urn:schemas-microsoft-com:office:word" xmlns:w="http://schemas.openxmlformats.org/wordprocessingml/2006/main" xmlns:w14="http://schemas.microsoft.com/office/word/2010/wordml" xmlns:w15="http://schemas.microsoft.com/office/word/2012/wordml" xmlns:wpg="http://schemas.microsoft.com/office/word/2010/wordprocessingGroup" xmlns:wpi="http://schemas.microsoft.com/office/word/2010/wordprocessingInk" xmlns:wne="http://schemas.microsoft.com/office/word/2006/wordml" xmlns:wps="http://schemas.microsoft.com/office/word/2010/wordprocessingShape" xmlns:wpsCustomData="http://www.wps.cn/officeDocument/2013/wpsCustomData" mc:Ignorable="w14 w15 wp14">
   <w:p>
     <w:pPr>
-      <w:pStyle w:val="Footer"/>
+      <w:pStyle w:val="5"/>
     </w:pPr>
   </w:p>
 </w:ftr>
 </file>
 
 <file path=word/footer3.xml><?xml version="1.0" encoding="utf-8"?>
-<w:ftr xmlns:wpc="http://schemas.microsoft.com/office/word/2010/wordprocessingCanvas" xmlns:cx="http://schemas.microsoft.com/office/drawing/2014/chartex" xmlns:cx1="http://schemas.microsoft.com/office/drawing/2015/9/8/chartex" xmlns:cx2="http://schemas.microsoft.com/office/drawing/2015/10/21/chartex" xmlns:cx3="http://schemas.microsoft.com/office/drawing/2016/5/9/chartex" xmlns:cx4="http://schemas.microsoft.com/office/drawing/2016/5/10/chartex" xmlns:cx5="http://schemas.microsoft.com/office/drawing/2016/5/11/chartex" xmlns:cx6="http://schemas.microsoft.com/office/drawing/2016/5/12/chartex" xmlns:cx7="http://schemas.microsoft.com/office/drawing/2016/5/13/chartex" xmlns:cx8="http://schemas.microsoft.com/office/drawing/2016/5/14/chartex" xmlns:mc="http://schemas.openxmlformats.org/markup-compatibility/2006" xmlns:aink="http://schemas.microsoft.com/office/drawing/2016/ink" xmlns:am3d="http://schemas.microsoft.com/office/drawing/2017/model3d" xmlns:o="urn:schemas-microsoft-com:office:office" xmlns:oel="http://schemas.microsoft.com/office/2019/extlst" xmlns:r="http://schemas.openxmlformats.org/officeDocument/2006/relationships" xmlns:m="http://schemas.openxmlformats.org/officeDocument/2006/math" xmlns:v="urn:schemas-microsoft-com:vml" xmlns:wp14="http://schemas.microsoft.com/office/word/2010/wordprocessingDrawing" xmlns:wp="http://schemas.openxmlformats.org/drawingml/2006/wordprocessingDrawing" xmlns:w10="urn:schemas-microsoft-com:office:word" xmlns:w="http://schemas.openxmlformats.org/wordprocessingml/2006/main" xmlns:w14="http://schemas.microsoft.com/office/word/2010/wordml" xmlns:w15="http://schemas.microsoft.com/office/word/2012/wordml" xmlns:w16cex="http://schemas.microsoft.com/office/word/2018/wordml/cex" xmlns:w16cid="http://schemas.microsoft.com/office/word/2016/wordml/cid" xmlns:w16="http://schemas.microsoft.com/office/word/2018/wordml" xmlns:w16du="http://schemas.microsoft.com/office/word/2023/wordml/word16du" xmlns:w16sdtdh="http://schemas.microsoft.com/office/word/2020/wordml/sdtdatahash" xmlns:w16se="http://schemas.microsoft.com/office/word/2015/wordml/symex" xmlns:wpg="http://schemas.microsoft.com/office/word/2010/wordprocessingGroup" xmlns:wpi="http://schemas.microsoft.com/office/word/2010/wordprocessingInk" xmlns:wne="http://schemas.microsoft.com/office/word/2006/wordml" xmlns:wps="http://schemas.microsoft.com/office/word/2010/wordprocessingShape" mc:Ignorable="w14 w15 w16se w16cid w16 w16cex w16sdtdh w16du wp14">
+<w:ftr xmlns:wpc="http://schemas.microsoft.com/office/word/2010/wordprocessingCanvas" xmlns:mc="http://schemas.openxmlformats.org/markup-compatibility/2006" xmlns:o="urn:schemas-microsoft-com:office:office" xmlns:r="http://schemas.openxmlformats.org/officeDocument/2006/relationships" xmlns:m="http://schemas.openxmlformats.org/officeDocument/2006/math" xmlns:v="urn:schemas-microsoft-com:vml" xmlns:wp14="http://schemas.microsoft.com/office/word/2010/wordprocessingDrawing" xmlns:wp="http://schemas.openxmlformats.org/drawingml/2006/wordprocessingDrawing" xmlns:w10="urn:schemas-microsoft-com:office:word" xmlns:w="http://schemas.openxmlformats.org/wordprocessingml/2006/main" xmlns:w14="http://schemas.microsoft.com/office/word/2010/wordml" xmlns:w15="http://schemas.microsoft.com/office/word/2012/wordml" xmlns:wpg="http://schemas.microsoft.com/office/word/2010/wordprocessingGroup" xmlns:wpi="http://schemas.microsoft.com/office/word/2010/wordprocessingInk" xmlns:wne="http://schemas.microsoft.com/office/word/2006/wordml" xmlns:wps="http://schemas.microsoft.com/office/word/2010/wordprocessingShape" xmlns:wpsCustomData="http://www.wps.cn/officeDocument/2013/wpsCustomData" mc:Ignorable="w14 w15 wp14">
   <w:p>
     <w:pPr>
-      <w:pStyle w:val="Footer"/>
+      <w:pStyle w:val="5"/>
     </w:pPr>
   </w:p>
 </w:ftr>
 </file>
 
 <file path=word/footnotes.xml><?xml version="1.0" encoding="utf-8"?>
-<w:footnotes xmlns:wpc="http://schemas.microsoft.com/office/word/2010/wordprocessingCanvas" xmlns:cx="http://schemas.microsoft.com/office/drawing/2014/chartex" xmlns:cx1="http://schemas.microsoft.com/office/drawing/2015/9/8/chartex" xmlns:cx2="http://schemas.microsoft.com/office/drawing/2015/10/21/chartex" xmlns:cx3="http://schemas.microsoft.com/office/drawing/2016/5/9/chartex" xmlns:cx4="http://schemas.microsoft.com/office/drawing/2016/5/10/chartex" xmlns:cx5="http://schemas.microsoft.com/office/drawing/2016/5/11/chartex" xmlns:cx6="http://schemas.microsoft.com/office/drawing/2016/5/12/chartex" xmlns:cx7="http://schemas.microsoft.com/office/drawing/2016/5/13/chartex" xmlns:cx8="http://schemas.microsoft.com/office/drawing/2016/5/14/chartex" xmlns:mc="http://schemas.openxmlformats.org/markup-compatibility/2006" xmlns:aink="http://schemas.microsoft.com/office/drawing/2016/ink" xmlns:am3d="http://schemas.microsoft.com/office/drawing/2017/model3d" xmlns:o="urn:schemas-microsoft-com:office:office" xmlns:oel="http://schemas.microsoft.com/office/2019/extlst" xmlns:r="http://schemas.openxmlformats.org/officeDocument/2006/relationships" xmlns:m="http://schemas.openxmlformats.org/officeDocument/2006/math" xmlns:v="urn:schemas-microsoft-com:vml" xmlns:wp14="http://schemas.microsoft.com/office/word/2010/wordprocessingDrawing" xmlns:wp="http://schemas.openxmlformats.org/drawingml/2006/wordprocessingDrawing" xmlns:w10="urn:schemas-microsoft-com:office:word" xmlns:w="http://schemas.openxmlformats.org/wordprocessingml/2006/main" xmlns:w14="http://schemas.microsoft.com/office/word/2010/wordml" xmlns:w15="http://schemas.microsoft.com/office/word/2012/wordml" xmlns:w16cex="http://schemas.microsoft.com/office/word/2018/wordml/cex" xmlns:w16cid="http://schemas.microsoft.com/office/word/2016/wordml/cid" xmlns:w16="http://schemas.microsoft.com/office/word/2018/wordml" xmlns:w16du="http://schemas.microsoft.com/office/word/2023/wordml/word16du" xmlns:w16sdtdh="http://schemas.microsoft.com/office/word/2020/wordml/sdtdatahash" xmlns:w16se="http://schemas.microsoft.com/office/word/2015/wordml/symex" xmlns:wpg="http://schemas.microsoft.com/office/word/2010/wordprocessingGroup" xmlns:wpi="http://schemas.microsoft.com/office/word/2010/wordprocessingInk" xmlns:wne="http://schemas.microsoft.com/office/word/2006/wordml" xmlns:wps="http://schemas.microsoft.com/office/word/2010/wordprocessingShape" mc:Ignorable="w14 w15 w16se w16cid w16 w16cex w16sdtdh w16du wp14">
-  <w:footnote w:type="separator" w:id="-1">
+<w:footnotes xmlns:wpc="http://schemas.microsoft.com/office/word/2010/wordprocessingCanvas" xmlns:mc="http://schemas.openxmlformats.org/markup-compatibility/2006" xmlns:o="urn:schemas-microsoft-com:office:office" xmlns:r="http://schemas.openxmlformats.org/officeDocument/2006/relationships" xmlns:m="http://schemas.openxmlformats.org/officeDocument/2006/math" xmlns:v="urn:schemas-microsoft-com:vml" xmlns:wp14="http://schemas.microsoft.com/office/word/2010/wordprocessingDrawing" xmlns:wp="http://schemas.openxmlformats.org/drawingml/2006/wordprocessingDrawing" xmlns:w="http://schemas.openxmlformats.org/wordprocessingml/2006/main" xmlns:w14="http://schemas.microsoft.com/office/word/2010/wordml" xmlns:w15="http://schemas.microsoft.com/office/word/2012/wordml" xmlns:w10="urn:schemas-microsoft-com:office:word" xmlns:wpg="http://schemas.microsoft.com/office/word/2010/wordprocessingGroup" xmlns:wpi="http://schemas.microsoft.com/office/word/2010/wordprocessingInk" xmlns:wne="http://schemas.microsoft.com/office/word/2006/wordml" xmlns:wps="http://schemas.microsoft.com/office/word/2010/wordprocessingShape" xmlns:wpsCustomData="http://www.wps.cn/officeDocument/2013/wpsCustomData" mc:Ignorable="w14 w15 wp14">
+  <w:footnote w:type="separator" w:id="0">
     <w:p>
       <w:pPr>
-        <w:spacing w:after="0" w:line="240" w:lineRule="auto"/>
+        <w:spacing w:before="0" w:after="0" w:line="259" w:lineRule="auto"/>
       </w:pPr>
       <w:r>
         <w:separator/>
       </w:r>
     </w:p>
   </w:footnote>
-  <w:footnote w:type="continuationSeparator" w:id="0">
+  <w:footnote w:type="continuationSeparator" w:id="1">
     <w:p>
       <w:pPr>
-        <w:spacing w:after="0" w:line="240" w:lineRule="auto"/>
+        <w:spacing w:before="0" w:after="0" w:line="259" w:lineRule="auto"/>
       </w:pPr>
       <w:r>
         <w:continuationSeparator/>
@@ -1082,17 +1727,7 @@
 </file>
 
 <file path=word/header1.xml><?xml version="1.0" encoding="utf-8"?>
-<w:hdr xmlns:wpc="http://schemas.microsoft.com/office/word/2010/wordprocessingCanvas" xmlns:cx="http://schemas.microsoft.com/office/drawing/2014/chartex" xmlns:cx1="http://schemas.microsoft.com/office/drawing/2015/9/8/chartex" xmlns:cx2="http://schemas.microsoft.com/office/drawing/2015/10/21/chartex" xmlns:cx3="http://schemas.microsoft.com/office/drawing/2016/5/9/chartex" xmlns:cx4="http://schemas.microsoft.com/office/drawing/2016/5/10/chartex" xmlns:cx5="http://schemas.microsoft.com/office/drawing/2016/5/11/chartex" xmlns:cx6="http://schemas.microsoft.com/office/drawing/2016/5/12/chartex" xmlns:cx7="http://schemas.microsoft.com/office/drawing/2016/5/13/chartex" xmlns:cx8="http://schemas.microsoft.com/office/drawing/2016/5/14/chartex" xmlns:mc="http://schemas.openxmlformats.org/markup-compatibility/2006" xmlns:aink="http://schemas.microsoft.com/office/drawing/2016/ink" xmlns:am3d="http://schemas.microsoft.com/office/drawing/2017/model3d" xmlns:o="urn:schemas-microsoft-com:office:office" xmlns:oel="http://schemas.microsoft.com/office/2019/extlst" xmlns:r="http://schemas.openxmlformats.org/officeDocument/2006/relationships" xmlns:m="http://schemas.openxmlformats.org/officeDocument/2006/math" xmlns:v="urn:schemas-microsoft-com:vml" xmlns:wp14="http://schemas.microsoft.com/office/word/2010/wordprocessingDrawing" xmlns:wp="http://schemas.openxmlformats.org/drawingml/2006/wordprocessingDrawing" xmlns:w10="urn:schemas-microsoft-com:office:word" xmlns:w="http://schemas.openxmlformats.org/wordprocessingml/2006/main" xmlns:w14="http://schemas.microsoft.com/office/word/2010/wordml" xmlns:w15="http://schemas.microsoft.com/office/word/2012/wordml" xmlns:w16cex="http://schemas.microsoft.com/office/word/2018/wordml/cex" xmlns:w16cid="http://schemas.microsoft.com/office/word/2016/wordml/cid" xmlns:w16="http://schemas.microsoft.com/office/word/2018/wordml" xmlns:w16du="http://schemas.microsoft.com/office/word/2023/wordml/word16du" xmlns:w16sdtdh="http://schemas.microsoft.com/office/word/2020/wordml/sdtdatahash" xmlns:w16se="http://schemas.microsoft.com/office/word/2015/wordml/symex" xmlns:wpg="http://schemas.microsoft.com/office/word/2010/wordprocessingGroup" xmlns:wpi="http://schemas.microsoft.com/office/word/2010/wordprocessingInk" xmlns:wne="http://schemas.microsoft.com/office/word/2006/wordml" xmlns:wps="http://schemas.microsoft.com/office/word/2010/wordprocessingShape" mc:Ignorable="w14 w15 w16se w16cid w16 w16cex w16sdtdh w16du wp14">
-  <w:p>
-    <w:pPr>
-      <w:pStyle w:val="Header"/>
-    </w:pPr>
-  </w:p>
-</w:hdr>
-</file>
-
-<file path=word/header2.xml><?xml version="1.0" encoding="utf-8"?>
-<w:hdr xmlns:wpc="http://schemas.microsoft.com/office/word/2010/wordprocessingCanvas" xmlns:cx="http://schemas.microsoft.com/office/drawing/2014/chartex" xmlns:cx1="http://schemas.microsoft.com/office/drawing/2015/9/8/chartex" xmlns:cx2="http://schemas.microsoft.com/office/drawing/2015/10/21/chartex" xmlns:cx3="http://schemas.microsoft.com/office/drawing/2016/5/9/chartex" xmlns:cx4="http://schemas.microsoft.com/office/drawing/2016/5/10/chartex" xmlns:cx5="http://schemas.microsoft.com/office/drawing/2016/5/11/chartex" xmlns:cx6="http://schemas.microsoft.com/office/drawing/2016/5/12/chartex" xmlns:cx7="http://schemas.microsoft.com/office/drawing/2016/5/13/chartex" xmlns:cx8="http://schemas.microsoft.com/office/drawing/2016/5/14/chartex" xmlns:mc="http://schemas.openxmlformats.org/markup-compatibility/2006" xmlns:aink="http://schemas.microsoft.com/office/drawing/2016/ink" xmlns:am3d="http://schemas.microsoft.com/office/drawing/2017/model3d" xmlns:o="urn:schemas-microsoft-com:office:office" xmlns:oel="http://schemas.microsoft.com/office/2019/extlst" xmlns:r="http://schemas.openxmlformats.org/officeDocument/2006/relationships" xmlns:m="http://schemas.openxmlformats.org/officeDocument/2006/math" xmlns:v="urn:schemas-microsoft-com:vml" xmlns:wp14="http://schemas.microsoft.com/office/word/2010/wordprocessingDrawing" xmlns:wp="http://schemas.openxmlformats.org/drawingml/2006/wordprocessingDrawing" xmlns:w10="urn:schemas-microsoft-com:office:word" xmlns:w="http://schemas.openxmlformats.org/wordprocessingml/2006/main" xmlns:w14="http://schemas.microsoft.com/office/word/2010/wordml" xmlns:w15="http://schemas.microsoft.com/office/word/2012/wordml" xmlns:w16cex="http://schemas.microsoft.com/office/word/2018/wordml/cex" xmlns:w16cid="http://schemas.microsoft.com/office/word/2016/wordml/cid" xmlns:w16="http://schemas.microsoft.com/office/word/2018/wordml" xmlns:w16du="http://schemas.microsoft.com/office/word/2023/wordml/word16du" xmlns:w16sdtdh="http://schemas.microsoft.com/office/word/2020/wordml/sdtdatahash" xmlns:w16se="http://schemas.microsoft.com/office/word/2015/wordml/symex" xmlns:wpg="http://schemas.microsoft.com/office/word/2010/wordprocessingGroup" xmlns:wpi="http://schemas.microsoft.com/office/word/2010/wordprocessingInk" xmlns:wne="http://schemas.microsoft.com/office/word/2006/wordml" xmlns:wps="http://schemas.microsoft.com/office/word/2010/wordprocessingShape" mc:Ignorable="w14 w15 w16se w16cid w16 w16cex w16sdtdh w16du wp14">
+<w:hdr xmlns:wpc="http://schemas.microsoft.com/office/word/2010/wordprocessingCanvas" xmlns:mc="http://schemas.openxmlformats.org/markup-compatibility/2006" xmlns:o="urn:schemas-microsoft-com:office:office" xmlns:r="http://schemas.openxmlformats.org/officeDocument/2006/relationships" xmlns:m="http://schemas.openxmlformats.org/officeDocument/2006/math" xmlns:v="urn:schemas-microsoft-com:vml" xmlns:wp14="http://schemas.microsoft.com/office/word/2010/wordprocessingDrawing" xmlns:wp="http://schemas.openxmlformats.org/drawingml/2006/wordprocessingDrawing" xmlns:w10="urn:schemas-microsoft-com:office:word" xmlns:w="http://schemas.openxmlformats.org/wordprocessingml/2006/main" xmlns:w14="http://schemas.microsoft.com/office/word/2010/wordml" xmlns:w15="http://schemas.microsoft.com/office/word/2012/wordml" xmlns:wpg="http://schemas.microsoft.com/office/word/2010/wordprocessingGroup" xmlns:wpi="http://schemas.microsoft.com/office/word/2010/wordprocessingInk" xmlns:wne="http://schemas.microsoft.com/office/word/2006/wordml" xmlns:wps="http://schemas.microsoft.com/office/word/2010/wordprocessingShape" xmlns:wpsCustomData="http://www.wps.cn/officeDocument/2013/wpsCustomData" mc:Ignorable="w14 w15 wp14">
   <w:p>
     <w:pPr>
       <w:tabs>
@@ -1109,12 +1744,11 @@
     <w:r>
       <w:rPr>
         <w:rFonts w:ascii="Century Gothic" w:hAnsi="Century Gothic"/>
-        <w:noProof/>
         <w:sz w:val="24"/>
         <w:szCs w:val="24"/>
       </w:rPr>
       <w:drawing>
-        <wp:anchor distT="0" distB="0" distL="114300" distR="114300" simplePos="0" relativeHeight="251660288" behindDoc="1" locked="0" layoutInCell="1" allowOverlap="1" wp14:anchorId="60E4E906" wp14:editId="4CC77766">
+        <wp:anchor distT="0" distB="0" distL="114300" distR="114300" simplePos="0" relativeHeight="251660288" behindDoc="1" locked="0" layoutInCell="1" allowOverlap="1">
           <wp:simplePos x="0" y="0"/>
           <wp:positionH relativeFrom="margin">
             <wp:posOffset>5367020</wp:posOffset>
@@ -1173,12 +1807,11 @@
     <w:r>
       <w:rPr>
         <w:rFonts w:ascii="Century Gothic" w:hAnsi="Century Gothic"/>
-        <w:noProof/>
         <w:sz w:val="20"/>
         <w:szCs w:val="24"/>
       </w:rPr>
       <w:drawing>
-        <wp:anchor distT="0" distB="0" distL="114300" distR="114300" simplePos="0" relativeHeight="251661312" behindDoc="1" locked="0" layoutInCell="1" allowOverlap="1" wp14:anchorId="659F733A" wp14:editId="31145DE6">
+        <wp:anchor distT="0" distB="0" distL="114300" distR="114300" simplePos="0" relativeHeight="251661312" behindDoc="1" locked="0" layoutInCell="1" allowOverlap="1">
           <wp:simplePos x="0" y="0"/>
           <wp:positionH relativeFrom="column">
             <wp:posOffset>440055</wp:posOffset>
@@ -1313,7 +1946,7 @@
       <w:rPr>
         <w:rFonts w:ascii="Bradley Hand ITC" w:hAnsi="Bradley Hand ITC"/>
         <w:b/>
-        <w:color w:val="F7CAAC" w:themeColor="accent2" w:themeTint="66"/>
+        <w:color w:val="F8CBAD" w:themeColor="accent2" w:themeTint="66"/>
         <w:sz w:val="28"/>
         <w:szCs w:val="24"/>
         <w14:textOutline w14:w="11112" w14:cap="flat" w14:cmpd="sng" w14:algn="ctr">
@@ -1323,13 +1956,21 @@
           <w14:prstDash w14:val="solid"/>
           <w14:round/>
         </w14:textOutline>
+        <w14:textFill>
+          <w14:solidFill>
+            <w14:schemeClr w14:val="accent2">
+              <w14:lumMod w14:val="40000"/>
+              <w14:lumOff w14:val="60000"/>
+            </w14:schemeClr>
+          </w14:solidFill>
+        </w14:textFill>
       </w:rPr>
     </w:pPr>
     <w:r>
       <w:rPr>
         <w:rFonts w:ascii="Bradley Hand ITC" w:hAnsi="Bradley Hand ITC"/>
         <w:b/>
-        <w:color w:val="F7CAAC" w:themeColor="accent2" w:themeTint="66"/>
+        <w:color w:val="F8CBAD" w:themeColor="accent2" w:themeTint="66"/>
         <w:sz w:val="28"/>
         <w:szCs w:val="24"/>
         <w14:textOutline w14:w="11112" w14:cap="flat" w14:cmpd="sng" w14:algn="ctr">
@@ -1339,6 +1980,14 @@
           <w14:prstDash w14:val="solid"/>
           <w14:round/>
         </w14:textOutline>
+        <w14:textFill>
+          <w14:solidFill>
+            <w14:schemeClr w14:val="accent2">
+              <w14:lumMod w14:val="40000"/>
+              <w14:lumOff w14:val="60000"/>
+            </w14:schemeClr>
+          </w14:solidFill>
+        </w14:textFill>
       </w:rPr>
       <w:t xml:space="preserve">           OFFICE OF THE SANGGUNIANG KABATAAN</w:t>
     </w:r>
@@ -1369,436 +2018,320 @@
   </w:p>
   <w:p>
     <w:pPr>
-      <w:pStyle w:val="Header"/>
+      <w:pStyle w:val="6"/>
+    </w:pPr>
+  </w:p>
+</w:hdr>
+</file>
+
+<file path=word/header2.xml><?xml version="1.0" encoding="utf-8"?>
+<w:hdr xmlns:wpc="http://schemas.microsoft.com/office/word/2010/wordprocessingCanvas" xmlns:mc="http://schemas.openxmlformats.org/markup-compatibility/2006" xmlns:o="urn:schemas-microsoft-com:office:office" xmlns:r="http://schemas.openxmlformats.org/officeDocument/2006/relationships" xmlns:m="http://schemas.openxmlformats.org/officeDocument/2006/math" xmlns:v="urn:schemas-microsoft-com:vml" xmlns:wp14="http://schemas.microsoft.com/office/word/2010/wordprocessingDrawing" xmlns:wp="http://schemas.openxmlformats.org/drawingml/2006/wordprocessingDrawing" xmlns:w10="urn:schemas-microsoft-com:office:word" xmlns:w="http://schemas.openxmlformats.org/wordprocessingml/2006/main" xmlns:w14="http://schemas.microsoft.com/office/word/2010/wordml" xmlns:w15="http://schemas.microsoft.com/office/word/2012/wordml" xmlns:wpg="http://schemas.microsoft.com/office/word/2010/wordprocessingGroup" xmlns:wpi="http://schemas.microsoft.com/office/word/2010/wordprocessingInk" xmlns:wne="http://schemas.microsoft.com/office/word/2006/wordml" xmlns:wps="http://schemas.microsoft.com/office/word/2010/wordprocessingShape" xmlns:wpsCustomData="http://www.wps.cn/officeDocument/2013/wpsCustomData" mc:Ignorable="w14 w15 wp14">
+  <w:p>
+    <w:pPr>
+      <w:pStyle w:val="6"/>
     </w:pPr>
   </w:p>
 </w:hdr>
 </file>
 
 <file path=word/header3.xml><?xml version="1.0" encoding="utf-8"?>
-<w:hdr xmlns:wpc="http://schemas.microsoft.com/office/word/2010/wordprocessingCanvas" xmlns:cx="http://schemas.microsoft.com/office/drawing/2014/chartex" xmlns:cx1="http://schemas.microsoft.com/office/drawing/2015/9/8/chartex" xmlns:cx2="http://schemas.microsoft.com/office/drawing/2015/10/21/chartex" xmlns:cx3="http://schemas.microsoft.com/office/drawing/2016/5/9/chartex" xmlns:cx4="http://schemas.microsoft.com/office/drawing/2016/5/10/chartex" xmlns:cx5="http://schemas.microsoft.com/office/drawing/2016/5/11/chartex" xmlns:cx6="http://schemas.microsoft.com/office/drawing/2016/5/12/chartex" xmlns:cx7="http://schemas.microsoft.com/office/drawing/2016/5/13/chartex" xmlns:cx8="http://schemas.microsoft.com/office/drawing/2016/5/14/chartex" xmlns:mc="http://schemas.openxmlformats.org/markup-compatibility/2006" xmlns:aink="http://schemas.microsoft.com/office/drawing/2016/ink" xmlns:am3d="http://schemas.microsoft.com/office/drawing/2017/model3d" xmlns:o="urn:schemas-microsoft-com:office:office" xmlns:oel="http://schemas.microsoft.com/office/2019/extlst" xmlns:r="http://schemas.openxmlformats.org/officeDocument/2006/relationships" xmlns:m="http://schemas.openxmlformats.org/officeDocument/2006/math" xmlns:v="urn:schemas-microsoft-com:vml" xmlns:wp14="http://schemas.microsoft.com/office/word/2010/wordprocessingDrawing" xmlns:wp="http://schemas.openxmlformats.org/drawingml/2006/wordprocessingDrawing" xmlns:w10="urn:schemas-microsoft-com:office:word" xmlns:w="http://schemas.openxmlformats.org/wordprocessingml/2006/main" xmlns:w14="http://schemas.microsoft.com/office/word/2010/wordml" xmlns:w15="http://schemas.microsoft.com/office/word/2012/wordml" xmlns:w16cex="http://schemas.microsoft.com/office/word/2018/wordml/cex" xmlns:w16cid="http://schemas.microsoft.com/office/word/2016/wordml/cid" xmlns:w16="http://schemas.microsoft.com/office/word/2018/wordml" xmlns:w16du="http://schemas.microsoft.com/office/word/2023/wordml/word16du" xmlns:w16sdtdh="http://schemas.microsoft.com/office/word/2020/wordml/sdtdatahash" xmlns:w16se="http://schemas.microsoft.com/office/word/2015/wordml/symex" xmlns:wpg="http://schemas.microsoft.com/office/word/2010/wordprocessingGroup" xmlns:wpi="http://schemas.microsoft.com/office/word/2010/wordprocessingInk" xmlns:wne="http://schemas.microsoft.com/office/word/2006/wordml" xmlns:wps="http://schemas.microsoft.com/office/word/2010/wordprocessingShape" mc:Ignorable="w14 w15 w16se w16cid w16 w16cex w16sdtdh w16du wp14">
+<w:hdr xmlns:wpc="http://schemas.microsoft.com/office/word/2010/wordprocessingCanvas" xmlns:mc="http://schemas.openxmlformats.org/markup-compatibility/2006" xmlns:o="urn:schemas-microsoft-com:office:office" xmlns:r="http://schemas.openxmlformats.org/officeDocument/2006/relationships" xmlns:m="http://schemas.openxmlformats.org/officeDocument/2006/math" xmlns:v="urn:schemas-microsoft-com:vml" xmlns:wp14="http://schemas.microsoft.com/office/word/2010/wordprocessingDrawing" xmlns:wp="http://schemas.openxmlformats.org/drawingml/2006/wordprocessingDrawing" xmlns:w10="urn:schemas-microsoft-com:office:word" xmlns:w="http://schemas.openxmlformats.org/wordprocessingml/2006/main" xmlns:w14="http://schemas.microsoft.com/office/word/2010/wordml" xmlns:w15="http://schemas.microsoft.com/office/word/2012/wordml" xmlns:wpg="http://schemas.microsoft.com/office/word/2010/wordprocessingGroup" xmlns:wpi="http://schemas.microsoft.com/office/word/2010/wordprocessingInk" xmlns:wne="http://schemas.microsoft.com/office/word/2006/wordml" xmlns:wps="http://schemas.microsoft.com/office/word/2010/wordprocessingShape" xmlns:wpsCustomData="http://www.wps.cn/officeDocument/2013/wpsCustomData" mc:Ignorable="w14 w15 wp14">
   <w:p>
     <w:pPr>
-      <w:pStyle w:val="Header"/>
+      <w:pStyle w:val="6"/>
     </w:pPr>
   </w:p>
 </w:hdr>
 </file>
 
 <file path=word/styles.xml><?xml version="1.0" encoding="utf-8"?>
-<w:styles xmlns:mc="http://schemas.openxmlformats.org/markup-compatibility/2006" xmlns:r="http://schemas.openxmlformats.org/officeDocument/2006/relationships" xmlns:w="http://schemas.openxmlformats.org/wordprocessingml/2006/main" xmlns:w14="http://schemas.microsoft.com/office/word/2010/wordml" xmlns:w15="http://schemas.microsoft.com/office/word/2012/wordml" xmlns:w16cex="http://schemas.microsoft.com/office/word/2018/wordml/cex" xmlns:w16cid="http://schemas.microsoft.com/office/word/2016/wordml/cid" xmlns:w16="http://schemas.microsoft.com/office/word/2018/wordml" xmlns:w16du="http://schemas.microsoft.com/office/word/2023/wordml/word16du" xmlns:w16sdtdh="http://schemas.microsoft.com/office/word/2020/wordml/sdtdatahash" xmlns:w16se="http://schemas.microsoft.com/office/word/2015/wordml/symex" mc:Ignorable="w14 w15 w16se w16cid w16 w16cex w16sdtdh w16du">
+<w:styles xmlns:mc="http://schemas.openxmlformats.org/markup-compatibility/2006" xmlns:o="urn:schemas-microsoft-com:office:office" xmlns:r="http://schemas.openxmlformats.org/officeDocument/2006/relationships" xmlns:m="http://schemas.openxmlformats.org/officeDocument/2006/math" xmlns:v="urn:schemas-microsoft-com:vml" xmlns:w="http://schemas.openxmlformats.org/wordprocessingml/2006/main" xmlns:w14="http://schemas.microsoft.com/office/word/2010/wordml" xmlns:w10="urn:schemas-microsoft-com:office:word" xmlns:sl="http://schemas.openxmlformats.org/schemaLibrary/2006/main" xmlns:wpsCustomData="http://www.wps.cn/officeDocument/2013/wpsCustomData" mc:Ignorable="w14">
   <w:docDefaults>
     <w:rPrDefault>
       <w:rPr>
-        <w:rFonts w:asciiTheme="minorHAnsi" w:eastAsiaTheme="minorHAnsi" w:hAnsiTheme="minorHAnsi" w:cstheme="minorBidi"/>
-        <w:lang w:val="en-US" w:eastAsia="en-US" w:bidi="ar-SA"/>
+        <w:rFonts w:ascii="Times New Roman" w:hAnsi="Times New Roman" w:eastAsia="SimSun" w:cs="Times New Roman"/>
       </w:rPr>
     </w:rPrDefault>
-    <w:pPrDefault>
-      <w:pPr>
-        <w:spacing w:after="160" w:line="259" w:lineRule="auto"/>
-      </w:pPr>
-    </w:pPrDefault>
+    <w:pPrDefault/>
   </w:docDefaults>
-  <w:latentStyles w:defLockedState="0" w:defUIPriority="99" w:defSemiHidden="0" w:defUnhideWhenUsed="0" w:defQFormat="0" w:count="376">
-    <w:lsdException w:name="Normal" w:uiPriority="0" w:qFormat="1"/>
-    <w:lsdException w:name="heading 1" w:uiPriority="9" w:qFormat="1"/>
-    <w:lsdException w:name="heading 2" w:semiHidden="1" w:uiPriority="9" w:unhideWhenUsed="1" w:qFormat="1"/>
-    <w:lsdException w:name="heading 3" w:semiHidden="1" w:uiPriority="9" w:unhideWhenUsed="1" w:qFormat="1"/>
-    <w:lsdException w:name="heading 4" w:semiHidden="1" w:uiPriority="9" w:unhideWhenUsed="1" w:qFormat="1"/>
-    <w:lsdException w:name="heading 5" w:semiHidden="1" w:uiPriority="9" w:unhideWhenUsed="1" w:qFormat="1"/>
-    <w:lsdException w:name="heading 6" w:semiHidden="1" w:uiPriority="9" w:unhideWhenUsed="1" w:qFormat="1"/>
-    <w:lsdException w:name="heading 7" w:semiHidden="1" w:uiPriority="9" w:unhideWhenUsed="1" w:qFormat="1"/>
-    <w:lsdException w:name="heading 8" w:semiHidden="1" w:uiPriority="9" w:unhideWhenUsed="1" w:qFormat="1"/>
-    <w:lsdException w:name="heading 9" w:semiHidden="1" w:uiPriority="9" w:unhideWhenUsed="1" w:qFormat="1"/>
-    <w:lsdException w:name="index 1" w:semiHidden="1" w:unhideWhenUsed="1"/>
-    <w:lsdException w:name="index 2" w:semiHidden="1" w:unhideWhenUsed="1"/>
-    <w:lsdException w:name="index 3" w:semiHidden="1" w:unhideWhenUsed="1"/>
-    <w:lsdException w:name="index 4" w:semiHidden="1" w:unhideWhenUsed="1"/>
-    <w:lsdException w:name="index 5" w:semiHidden="1" w:unhideWhenUsed="1"/>
-    <w:lsdException w:name="index 6" w:semiHidden="1" w:unhideWhenUsed="1"/>
-    <w:lsdException w:name="index 7" w:semiHidden="1" w:unhideWhenUsed="1"/>
-    <w:lsdException w:name="index 8" w:semiHidden="1" w:unhideWhenUsed="1"/>
-    <w:lsdException w:name="index 9" w:semiHidden="1" w:unhideWhenUsed="1"/>
-    <w:lsdException w:name="toc 1" w:semiHidden="1" w:uiPriority="39" w:unhideWhenUsed="1"/>
-    <w:lsdException w:name="toc 2" w:semiHidden="1" w:uiPriority="39" w:unhideWhenUsed="1"/>
-    <w:lsdException w:name="toc 3" w:semiHidden="1" w:uiPriority="39" w:unhideWhenUsed="1"/>
-    <w:lsdException w:name="toc 4" w:semiHidden="1" w:uiPriority="39" w:unhideWhenUsed="1"/>
-    <w:lsdException w:name="toc 5" w:semiHidden="1" w:uiPriority="39" w:unhideWhenUsed="1"/>
-    <w:lsdException w:name="toc 6" w:semiHidden="1" w:uiPriority="39" w:unhideWhenUsed="1"/>
-    <w:lsdException w:name="toc 7" w:semiHidden="1" w:uiPriority="39" w:unhideWhenUsed="1"/>
-    <w:lsdException w:name="toc 8" w:semiHidden="1" w:uiPriority="39" w:unhideWhenUsed="1"/>
-    <w:lsdException w:name="toc 9" w:semiHidden="1" w:uiPriority="39" w:unhideWhenUsed="1"/>
-    <w:lsdException w:name="Normal Indent" w:semiHidden="1" w:unhideWhenUsed="1"/>
-    <w:lsdException w:name="footnote text" w:semiHidden="1" w:unhideWhenUsed="1"/>
-    <w:lsdException w:name="annotation text" w:semiHidden="1" w:unhideWhenUsed="1"/>
-    <w:lsdException w:name="header" w:unhideWhenUsed="1"/>
-    <w:lsdException w:name="footer" w:unhideWhenUsed="1"/>
-    <w:lsdException w:name="index heading" w:semiHidden="1" w:unhideWhenUsed="1"/>
-    <w:lsdException w:name="caption" w:semiHidden="1" w:uiPriority="35" w:unhideWhenUsed="1" w:qFormat="1"/>
-    <w:lsdException w:name="table of figures" w:semiHidden="1" w:unhideWhenUsed="1"/>
-    <w:lsdException w:name="envelope address" w:semiHidden="1" w:unhideWhenUsed="1"/>
-    <w:lsdException w:name="envelope return" w:semiHidden="1" w:unhideWhenUsed="1"/>
-    <w:lsdException w:name="footnote reference" w:semiHidden="1" w:unhideWhenUsed="1"/>
-    <w:lsdException w:name="annotation reference" w:semiHidden="1" w:unhideWhenUsed="1"/>
-    <w:lsdException w:name="line number" w:semiHidden="1" w:unhideWhenUsed="1"/>
-    <w:lsdException w:name="page number" w:semiHidden="1" w:unhideWhenUsed="1"/>
-    <w:lsdException w:name="endnote reference" w:semiHidden="1" w:unhideWhenUsed="1"/>
-    <w:lsdException w:name="endnote text" w:semiHidden="1" w:unhideWhenUsed="1"/>
-    <w:lsdException w:name="table of authorities" w:semiHidden="1" w:unhideWhenUsed="1"/>
-    <w:lsdException w:name="macro" w:semiHidden="1" w:unhideWhenUsed="1"/>
-    <w:lsdException w:name="toa heading" w:semiHidden="1" w:unhideWhenUsed="1"/>
-    <w:lsdException w:name="List" w:semiHidden="1" w:unhideWhenUsed="1"/>
-    <w:lsdException w:name="List Bullet" w:semiHidden="1" w:unhideWhenUsed="1"/>
-    <w:lsdException w:name="List Number" w:semiHidden="1" w:unhideWhenUsed="1"/>
-    <w:lsdException w:name="List 2" w:semiHidden="1" w:unhideWhenUsed="1"/>
-    <w:lsdException w:name="List 3" w:semiHidden="1" w:unhideWhenUsed="1"/>
-    <w:lsdException w:name="List 4" w:semiHidden="1" w:unhideWhenUsed="1"/>
-    <w:lsdException w:name="List 5" w:semiHidden="1" w:unhideWhenUsed="1"/>
-    <w:lsdException w:name="List Bullet 2" w:semiHidden="1" w:unhideWhenUsed="1"/>
-    <w:lsdException w:name="List Bullet 3" w:semiHidden="1" w:unhideWhenUsed="1"/>
-    <w:lsdException w:name="List Bullet 4" w:semiHidden="1" w:unhideWhenUsed="1"/>
-    <w:lsdException w:name="List Bullet 5" w:semiHidden="1" w:unhideWhenUsed="1"/>
-    <w:lsdException w:name="List Number 2" w:semiHidden="1" w:unhideWhenUsed="1"/>
-    <w:lsdException w:name="List Number 3" w:semiHidden="1" w:unhideWhenUsed="1"/>
-    <w:lsdException w:name="List Number 4" w:semiHidden="1" w:unhideWhenUsed="1"/>
-    <w:lsdException w:name="List Number 5" w:semiHidden="1" w:unhideWhenUsed="1"/>
-    <w:lsdException w:name="Title" w:uiPriority="10" w:qFormat="1"/>
-    <w:lsdException w:name="Closing" w:semiHidden="1" w:unhideWhenUsed="1"/>
-    <w:lsdException w:name="Signature" w:semiHidden="1" w:unhideWhenUsed="1"/>
-    <w:lsdException w:name="Default Paragraph Font" w:semiHidden="1" w:uiPriority="1" w:unhideWhenUsed="1"/>
-    <w:lsdException w:name="Body Text" w:semiHidden="1" w:unhideWhenUsed="1"/>
-    <w:lsdException w:name="Body Text Indent" w:semiHidden="1" w:unhideWhenUsed="1"/>
-    <w:lsdException w:name="List Continue" w:semiHidden="1" w:unhideWhenUsed="1"/>
-    <w:lsdException w:name="List Continue 2" w:semiHidden="1" w:unhideWhenUsed="1"/>
-    <w:lsdException w:name="List Continue 3" w:semiHidden="1" w:unhideWhenUsed="1"/>
-    <w:lsdException w:name="List Continue 4" w:semiHidden="1" w:unhideWhenUsed="1"/>
-    <w:lsdException w:name="List Continue 5" w:semiHidden="1" w:unhideWhenUsed="1"/>
-    <w:lsdException w:name="Message Header" w:semiHidden="1" w:unhideWhenUsed="1"/>
-    <w:lsdException w:name="Subtitle" w:uiPriority="11" w:qFormat="1"/>
-    <w:lsdException w:name="Salutation" w:semiHidden="1" w:unhideWhenUsed="1"/>
-    <w:lsdException w:name="Date" w:semiHidden="1" w:unhideWhenUsed="1"/>
-    <w:lsdException w:name="Body Text First Indent" w:semiHidden="1" w:unhideWhenUsed="1"/>
-    <w:lsdException w:name="Body Text First Indent 2" w:semiHidden="1" w:unhideWhenUsed="1"/>
-    <w:lsdException w:name="Note Heading" w:semiHidden="1" w:unhideWhenUsed="1"/>
-    <w:lsdException w:name="Body Text 2" w:semiHidden="1" w:unhideWhenUsed="1"/>
-    <w:lsdException w:name="Body Text 3" w:semiHidden="1" w:unhideWhenUsed="1"/>
-    <w:lsdException w:name="Body Text Indent 2" w:semiHidden="1" w:unhideWhenUsed="1"/>
-    <w:lsdException w:name="Body Text Indent 3" w:semiHidden="1" w:unhideWhenUsed="1"/>
-    <w:lsdException w:name="Block Text" w:semiHidden="1" w:unhideWhenUsed="1"/>
-    <w:lsdException w:name="Hyperlink" w:semiHidden="1" w:unhideWhenUsed="1"/>
-    <w:lsdException w:name="FollowedHyperlink" w:semiHidden="1" w:unhideWhenUsed="1"/>
-    <w:lsdException w:name="Strong" w:uiPriority="22" w:qFormat="1"/>
-    <w:lsdException w:name="Emphasis" w:uiPriority="20" w:qFormat="1"/>
-    <w:lsdException w:name="Document Map" w:semiHidden="1" w:unhideWhenUsed="1"/>
-    <w:lsdException w:name="Plain Text" w:semiHidden="1" w:unhideWhenUsed="1"/>
-    <w:lsdException w:name="E-mail Signature" w:semiHidden="1" w:unhideWhenUsed="1"/>
-    <w:lsdException w:name="HTML Top of Form" w:semiHidden="1" w:unhideWhenUsed="1"/>
-    <w:lsdException w:name="HTML Bottom of Form" w:semiHidden="1" w:unhideWhenUsed="1"/>
-    <w:lsdException w:name="Normal (Web)" w:semiHidden="1" w:unhideWhenUsed="1"/>
-    <w:lsdException w:name="HTML Acronym" w:semiHidden="1" w:unhideWhenUsed="1"/>
-    <w:lsdException w:name="HTML Address" w:semiHidden="1" w:unhideWhenUsed="1"/>
-    <w:lsdException w:name="HTML Cite" w:semiHidden="1" w:unhideWhenUsed="1"/>
-    <w:lsdException w:name="HTML Code" w:semiHidden="1" w:unhideWhenUsed="1"/>
-    <w:lsdException w:name="HTML Definition" w:semiHidden="1" w:unhideWhenUsed="1"/>
-    <w:lsdException w:name="HTML Keyboard" w:semiHidden="1" w:unhideWhenUsed="1"/>
-    <w:lsdException w:name="HTML Preformatted" w:semiHidden="1" w:unhideWhenUsed="1"/>
-    <w:lsdException w:name="HTML Sample" w:semiHidden="1" w:unhideWhenUsed="1"/>
-    <w:lsdException w:name="HTML Typewriter" w:semiHidden="1" w:unhideWhenUsed="1"/>
-    <w:lsdException w:name="HTML Variable" w:semiHidden="1" w:unhideWhenUsed="1"/>
-    <w:lsdException w:name="Normal Table" w:semiHidden="1" w:unhideWhenUsed="1"/>
-    <w:lsdException w:name="annotation subject" w:semiHidden="1" w:unhideWhenUsed="1"/>
-    <w:lsdException w:name="No List" w:semiHidden="1" w:unhideWhenUsed="1"/>
-    <w:lsdException w:name="Outline List 1" w:semiHidden="1" w:unhideWhenUsed="1"/>
-    <w:lsdException w:name="Outline List 2" w:semiHidden="1" w:unhideWhenUsed="1"/>
-    <w:lsdException w:name="Outline List 3" w:semiHidden="1" w:unhideWhenUsed="1"/>
-    <w:lsdException w:name="Table Simple 1" w:semiHidden="1" w:unhideWhenUsed="1"/>
-    <w:lsdException w:name="Table Simple 2" w:semiHidden="1" w:unhideWhenUsed="1"/>
-    <w:lsdException w:name="Table Simple 3" w:semiHidden="1" w:unhideWhenUsed="1"/>
-    <w:lsdException w:name="Table Classic 1" w:semiHidden="1" w:unhideWhenUsed="1"/>
-    <w:lsdException w:name="Table Classic 2" w:semiHidden="1" w:unhideWhenUsed="1"/>
-    <w:lsdException w:name="Table Classic 3" w:semiHidden="1" w:unhideWhenUsed="1"/>
-    <w:lsdException w:name="Table Classic 4" w:semiHidden="1" w:unhideWhenUsed="1"/>
-    <w:lsdException w:name="Table Colorful 1" w:semiHidden="1" w:unhideWhenUsed="1"/>
-    <w:lsdException w:name="Table Colorful 2" w:semiHidden="1" w:unhideWhenUsed="1"/>
-    <w:lsdException w:name="Table Colorful 3" w:semiHidden="1" w:unhideWhenUsed="1"/>
-    <w:lsdException w:name="Table Columns 1" w:semiHidden="1" w:unhideWhenUsed="1"/>
-    <w:lsdException w:name="Table Columns 2" w:semiHidden="1" w:unhideWhenUsed="1"/>
-    <w:lsdException w:name="Table Columns 3" w:semiHidden="1" w:unhideWhenUsed="1"/>
-    <w:lsdException w:name="Table Columns 4" w:semiHidden="1" w:unhideWhenUsed="1"/>
-    <w:lsdException w:name="Table Columns 5" w:semiHidden="1" w:unhideWhenUsed="1"/>
-    <w:lsdException w:name="Table Grid 1" w:semiHidden="1" w:unhideWhenUsed="1"/>
-    <w:lsdException w:name="Table Grid 2" w:semiHidden="1" w:unhideWhenUsed="1"/>
-    <w:lsdException w:name="Table Grid 3" w:semiHidden="1" w:unhideWhenUsed="1"/>
-    <w:lsdException w:name="Table Grid 4" w:semiHidden="1" w:unhideWhenUsed="1"/>
-    <w:lsdException w:name="Table Grid 5" w:semiHidden="1" w:unhideWhenUsed="1"/>
-    <w:lsdException w:name="Table Grid 6" w:semiHidden="1" w:unhideWhenUsed="1"/>
-    <w:lsdException w:name="Table Grid 7" w:semiHidden="1" w:unhideWhenUsed="1"/>
-    <w:lsdException w:name="Table Grid 8" w:semiHidden="1" w:unhideWhenUsed="1"/>
-    <w:lsdException w:name="Table List 1" w:semiHidden="1" w:unhideWhenUsed="1"/>
-    <w:lsdException w:name="Table List 2" w:semiHidden="1" w:unhideWhenUsed="1"/>
-    <w:lsdException w:name="Table List 3" w:semiHidden="1" w:unhideWhenUsed="1"/>
-    <w:lsdException w:name="Table List 4" w:semiHidden="1" w:unhideWhenUsed="1"/>
-    <w:lsdException w:name="Table List 5" w:semiHidden="1" w:unhideWhenUsed="1"/>
-    <w:lsdException w:name="Table List 6" w:semiHidden="1" w:unhideWhenUsed="1"/>
-    <w:lsdException w:name="Table List 7" w:semiHidden="1" w:unhideWhenUsed="1"/>
-    <w:lsdException w:name="Table List 8" w:semiHidden="1" w:unhideWhenUsed="1"/>
-    <w:lsdException w:name="Table 3D effects 1" w:semiHidden="1" w:unhideWhenUsed="1"/>
-    <w:lsdException w:name="Table 3D effects 2" w:semiHidden="1" w:unhideWhenUsed="1"/>
-    <w:lsdException w:name="Table 3D effects 3" w:semiHidden="1" w:unhideWhenUsed="1"/>
-    <w:lsdException w:name="Table Contemporary" w:semiHidden="1" w:unhideWhenUsed="1"/>
-    <w:lsdException w:name="Table Elegant" w:semiHidden="1" w:unhideWhenUsed="1"/>
-    <w:lsdException w:name="Table Professional" w:semiHidden="1" w:unhideWhenUsed="1"/>
-    <w:lsdException w:name="Table Subtle 1" w:semiHidden="1" w:unhideWhenUsed="1"/>
-    <w:lsdException w:name="Table Subtle 2" w:semiHidden="1" w:unhideWhenUsed="1"/>
-    <w:lsdException w:name="Table Web 1" w:semiHidden="1" w:unhideWhenUsed="1"/>
-    <w:lsdException w:name="Table Web 2" w:semiHidden="1" w:unhideWhenUsed="1"/>
-    <w:lsdException w:name="Table Web 3" w:semiHidden="1" w:unhideWhenUsed="1"/>
-    <w:lsdException w:name="Balloon Text" w:semiHidden="1" w:unhideWhenUsed="1" w:qFormat="1"/>
-    <w:lsdException w:name="Table Grid" w:uiPriority="39"/>
-    <w:lsdException w:name="Table Theme" w:semiHidden="1" w:unhideWhenUsed="1"/>
-    <w:lsdException w:name="Placeholder Text" w:semiHidden="1" w:unhideWhenUsed="1"/>
-    <w:lsdException w:name="No Spacing" w:semiHidden="1" w:unhideWhenUsed="1"/>
-    <w:lsdException w:name="Light Shading" w:uiPriority="60"/>
-    <w:lsdException w:name="Light List" w:uiPriority="61"/>
-    <w:lsdException w:name="Light Grid" w:uiPriority="62"/>
-    <w:lsdException w:name="Medium Shading 1" w:uiPriority="63"/>
-    <w:lsdException w:name="Medium Shading 2" w:uiPriority="64"/>
-    <w:lsdException w:name="Medium List 1" w:uiPriority="65"/>
-    <w:lsdException w:name="Medium List 2" w:uiPriority="66"/>
-    <w:lsdException w:name="Medium Grid 1" w:uiPriority="67"/>
-    <w:lsdException w:name="Medium Grid 2" w:uiPriority="68"/>
-    <w:lsdException w:name="Medium Grid 3" w:uiPriority="69"/>
-    <w:lsdException w:name="Dark List" w:uiPriority="70"/>
-    <w:lsdException w:name="Colorful Shading" w:uiPriority="71"/>
-    <w:lsdException w:name="Colorful List" w:uiPriority="72"/>
-    <w:lsdException w:name="Colorful Grid" w:uiPriority="73"/>
-    <w:lsdException w:name="Light Shading Accent 1" w:uiPriority="60"/>
-    <w:lsdException w:name="Light List Accent 1" w:uiPriority="61"/>
-    <w:lsdException w:name="Light Grid Accent 1" w:uiPriority="62"/>
-    <w:lsdException w:name="Medium Shading 1 Accent 1" w:uiPriority="63"/>
-    <w:lsdException w:name="Medium Shading 2 Accent 1" w:uiPriority="64"/>
-    <w:lsdException w:name="Medium List 1 Accent 1" w:uiPriority="65"/>
-    <w:lsdException w:name="Revision" w:semiHidden="1" w:unhideWhenUsed="1"/>
-    <w:lsdException w:name="List Paragraph" w:semiHidden="1" w:unhideWhenUsed="1"/>
-    <w:lsdException w:name="Quote" w:semiHidden="1" w:unhideWhenUsed="1"/>
-    <w:lsdException w:name="Intense Quote" w:semiHidden="1" w:unhideWhenUsed="1"/>
-    <w:lsdException w:name="Medium List 2 Accent 1" w:uiPriority="66"/>
-    <w:lsdException w:name="Medium Grid 1 Accent 1" w:uiPriority="67"/>
-    <w:lsdException w:name="Medium Grid 2 Accent 1" w:uiPriority="68"/>
-    <w:lsdException w:name="Medium Grid 3 Accent 1" w:uiPriority="69"/>
-    <w:lsdException w:name="Dark List Accent 1" w:uiPriority="70"/>
-    <w:lsdException w:name="Colorful Shading Accent 1" w:uiPriority="71"/>
-    <w:lsdException w:name="Colorful List Accent 1" w:uiPriority="72"/>
-    <w:lsdException w:name="Colorful Grid Accent 1" w:uiPriority="73"/>
-    <w:lsdException w:name="Light Shading Accent 2" w:uiPriority="60"/>
-    <w:lsdException w:name="Light List Accent 2" w:uiPriority="61"/>
-    <w:lsdException w:name="Light Grid Accent 2" w:uiPriority="62"/>
-    <w:lsdException w:name="Medium Shading 1 Accent 2" w:uiPriority="63"/>
-    <w:lsdException w:name="Medium Shading 2 Accent 2" w:uiPriority="64"/>
-    <w:lsdException w:name="Medium List 1 Accent 2" w:uiPriority="65"/>
-    <w:lsdException w:name="Medium List 2 Accent 2" w:uiPriority="66"/>
-    <w:lsdException w:name="Medium Grid 1 Accent 2" w:uiPriority="67"/>
-    <w:lsdException w:name="Medium Grid 2 Accent 2" w:uiPriority="68"/>
-    <w:lsdException w:name="Medium Grid 3 Accent 2" w:uiPriority="69"/>
-    <w:lsdException w:name="Dark List Accent 2" w:uiPriority="70"/>
-    <w:lsdException w:name="Colorful Shading Accent 2" w:uiPriority="71"/>
-    <w:lsdException w:name="Colorful List Accent 2" w:uiPriority="72"/>
-    <w:lsdException w:name="Colorful Grid Accent 2" w:uiPriority="73"/>
-    <w:lsdException w:name="Light Shading Accent 3" w:uiPriority="60"/>
-    <w:lsdException w:name="Light List Accent 3" w:uiPriority="61"/>
-    <w:lsdException w:name="Light Grid Accent 3" w:uiPriority="62"/>
-    <w:lsdException w:name="Medium Shading 1 Accent 3" w:uiPriority="63"/>
-    <w:lsdException w:name="Medium Shading 2 Accent 3" w:uiPriority="64"/>
-    <w:lsdException w:name="Medium List 1 Accent 3" w:uiPriority="65"/>
-    <w:lsdException w:name="Medium List 2 Accent 3" w:uiPriority="66"/>
-    <w:lsdException w:name="Medium Grid 1 Accent 3" w:uiPriority="67"/>
-    <w:lsdException w:name="Medium Grid 2 Accent 3" w:uiPriority="68"/>
-    <w:lsdException w:name="Medium Grid 3 Accent 3" w:uiPriority="69"/>
-    <w:lsdException w:name="Dark List Accent 3" w:uiPriority="70"/>
-    <w:lsdException w:name="Colorful Shading Accent 3" w:uiPriority="71"/>
-    <w:lsdException w:name="Colorful List Accent 3" w:uiPriority="72"/>
-    <w:lsdException w:name="Colorful Grid Accent 3" w:uiPriority="73"/>
-    <w:lsdException w:name="Light Shading Accent 4" w:uiPriority="60"/>
-    <w:lsdException w:name="Light List Accent 4" w:uiPriority="61"/>
-    <w:lsdException w:name="Light Grid Accent 4" w:uiPriority="62"/>
-    <w:lsdException w:name="Medium Shading 1 Accent 4" w:uiPriority="63"/>
-    <w:lsdException w:name="Medium Shading 2 Accent 4" w:uiPriority="64"/>
-    <w:lsdException w:name="Medium List 1 Accent 4" w:uiPriority="65"/>
-    <w:lsdException w:name="Medium List 2 Accent 4" w:uiPriority="66"/>
-    <w:lsdException w:name="Medium Grid 1 Accent 4" w:uiPriority="67"/>
-    <w:lsdException w:name="Medium Grid 2 Accent 4" w:uiPriority="68"/>
-    <w:lsdException w:name="Medium Grid 3 Accent 4" w:uiPriority="69"/>
-    <w:lsdException w:name="Dark List Accent 4" w:uiPriority="70"/>
-    <w:lsdException w:name="Colorful Shading Accent 4" w:uiPriority="71"/>
-    <w:lsdException w:name="Colorful List Accent 4" w:uiPriority="72"/>
-    <w:lsdException w:name="Colorful Grid Accent 4" w:uiPriority="73"/>
-    <w:lsdException w:name="Light Shading Accent 5" w:uiPriority="60"/>
-    <w:lsdException w:name="Light List Accent 5" w:uiPriority="61"/>
-    <w:lsdException w:name="Light Grid Accent 5" w:uiPriority="62"/>
-    <w:lsdException w:name="Medium Shading 1 Accent 5" w:uiPriority="63"/>
-    <w:lsdException w:name="Medium Shading 2 Accent 5" w:uiPriority="64"/>
-    <w:lsdException w:name="Medium List 1 Accent 5" w:uiPriority="65"/>
-    <w:lsdException w:name="Medium List 2 Accent 5" w:uiPriority="66"/>
-    <w:lsdException w:name="Medium Grid 1 Accent 5" w:uiPriority="67"/>
-    <w:lsdException w:name="Medium Grid 2 Accent 5" w:uiPriority="68"/>
-    <w:lsdException w:name="Medium Grid 3 Accent 5" w:uiPriority="69"/>
-    <w:lsdException w:name="Dark List Accent 5" w:uiPriority="70"/>
-    <w:lsdException w:name="Colorful Shading Accent 5" w:uiPriority="71"/>
-    <w:lsdException w:name="Colorful List Accent 5" w:uiPriority="72"/>
-    <w:lsdException w:name="Colorful Grid Accent 5" w:uiPriority="73"/>
-    <w:lsdException w:name="Light Shading Accent 6" w:uiPriority="60"/>
-    <w:lsdException w:name="Light List Accent 6" w:uiPriority="61"/>
-    <w:lsdException w:name="Light Grid Accent 6" w:uiPriority="62"/>
-    <w:lsdException w:name="Medium Shading 1 Accent 6" w:uiPriority="63"/>
-    <w:lsdException w:name="Medium Shading 2 Accent 6" w:uiPriority="64"/>
-    <w:lsdException w:name="Medium List 1 Accent 6" w:uiPriority="65"/>
-    <w:lsdException w:name="Medium List 2 Accent 6" w:uiPriority="66"/>
-    <w:lsdException w:name="Medium Grid 1 Accent 6" w:uiPriority="67"/>
-    <w:lsdException w:name="Medium Grid 2 Accent 6" w:uiPriority="68"/>
-    <w:lsdException w:name="Medium Grid 3 Accent 6" w:uiPriority="69"/>
-    <w:lsdException w:name="Dark List Accent 6" w:uiPriority="70"/>
-    <w:lsdException w:name="Colorful Shading Accent 6" w:uiPriority="71"/>
-    <w:lsdException w:name="Colorful List Accent 6" w:uiPriority="72"/>
-    <w:lsdException w:name="Colorful Grid Accent 6" w:uiPriority="73"/>
-    <w:lsdException w:name="Subtle Emphasis" w:uiPriority="19" w:qFormat="1"/>
-    <w:lsdException w:name="Intense Emphasis" w:uiPriority="21" w:qFormat="1"/>
-    <w:lsdException w:name="Subtle Reference" w:uiPriority="31" w:qFormat="1"/>
-    <w:lsdException w:name="Intense Reference" w:uiPriority="32" w:qFormat="1"/>
-    <w:lsdException w:name="Book Title" w:uiPriority="33" w:qFormat="1"/>
-    <w:lsdException w:name="Bibliography" w:semiHidden="1" w:uiPriority="37" w:unhideWhenUsed="1"/>
-    <w:lsdException w:name="TOC Heading" w:semiHidden="1" w:uiPriority="39" w:unhideWhenUsed="1" w:qFormat="1"/>
-    <w:lsdException w:name="Plain Table 1" w:uiPriority="41"/>
-    <w:lsdException w:name="Plain Table 2" w:uiPriority="42"/>
-    <w:lsdException w:name="Plain Table 3" w:uiPriority="43"/>
-    <w:lsdException w:name="Plain Table 4" w:uiPriority="44"/>
-    <w:lsdException w:name="Plain Table 5" w:uiPriority="45"/>
-    <w:lsdException w:name="Grid Table Light" w:uiPriority="40"/>
-    <w:lsdException w:name="Grid Table 1 Light" w:uiPriority="46"/>
-    <w:lsdException w:name="Grid Table 2" w:uiPriority="47"/>
-    <w:lsdException w:name="Grid Table 3" w:uiPriority="48"/>
-    <w:lsdException w:name="Grid Table 4" w:uiPriority="49"/>
-    <w:lsdException w:name="Grid Table 5 Dark" w:uiPriority="50"/>
-    <w:lsdException w:name="Grid Table 6 Colorful" w:uiPriority="51"/>
-    <w:lsdException w:name="Grid Table 7 Colorful" w:uiPriority="52"/>
-    <w:lsdException w:name="Grid Table 1 Light Accent 1" w:uiPriority="46"/>
-    <w:lsdException w:name="Grid Table 2 Accent 1" w:uiPriority="47"/>
-    <w:lsdException w:name="Grid Table 3 Accent 1" w:uiPriority="48"/>
-    <w:lsdException w:name="Grid Table 4 Accent 1" w:uiPriority="49"/>
-    <w:lsdException w:name="Grid Table 5 Dark Accent 1" w:uiPriority="50"/>
-    <w:lsdException w:name="Grid Table 6 Colorful Accent 1" w:uiPriority="51"/>
-    <w:lsdException w:name="Grid Table 7 Colorful Accent 1" w:uiPriority="52"/>
-    <w:lsdException w:name="Grid Table 1 Light Accent 2" w:uiPriority="46"/>
-    <w:lsdException w:name="Grid Table 2 Accent 2" w:uiPriority="47"/>
-    <w:lsdException w:name="Grid Table 3 Accent 2" w:uiPriority="48"/>
-    <w:lsdException w:name="Grid Table 4 Accent 2" w:uiPriority="49"/>
-    <w:lsdException w:name="Grid Table 5 Dark Accent 2" w:uiPriority="50"/>
-    <w:lsdException w:name="Grid Table 6 Colorful Accent 2" w:uiPriority="51"/>
-    <w:lsdException w:name="Grid Table 7 Colorful Accent 2" w:uiPriority="52"/>
-    <w:lsdException w:name="Grid Table 1 Light Accent 3" w:uiPriority="46"/>
-    <w:lsdException w:name="Grid Table 2 Accent 3" w:uiPriority="47"/>
-    <w:lsdException w:name="Grid Table 3 Accent 3" w:uiPriority="48"/>
-    <w:lsdException w:name="Grid Table 4 Accent 3" w:uiPriority="49"/>
-    <w:lsdException w:name="Grid Table 5 Dark Accent 3" w:uiPriority="50"/>
-    <w:lsdException w:name="Grid Table 6 Colorful Accent 3" w:uiPriority="51"/>
-    <w:lsdException w:name="Grid Table 7 Colorful Accent 3" w:uiPriority="52"/>
-    <w:lsdException w:name="Grid Table 1 Light Accent 4" w:uiPriority="46"/>
-    <w:lsdException w:name="Grid Table 2 Accent 4" w:uiPriority="47"/>
-    <w:lsdException w:name="Grid Table 3 Accent 4" w:uiPriority="48"/>
-    <w:lsdException w:name="Grid Table 4 Accent 4" w:uiPriority="49"/>
-    <w:lsdException w:name="Grid Table 5 Dark Accent 4" w:uiPriority="50"/>
-    <w:lsdException w:name="Grid Table 6 Colorful Accent 4" w:uiPriority="51"/>
-    <w:lsdException w:name="Grid Table 7 Colorful Accent 4" w:uiPriority="52"/>
-    <w:lsdException w:name="Grid Table 1 Light Accent 5" w:uiPriority="46"/>
-    <w:lsdException w:name="Grid Table 2 Accent 5" w:uiPriority="47"/>
-    <w:lsdException w:name="Grid Table 3 Accent 5" w:uiPriority="48"/>
-    <w:lsdException w:name="Grid Table 4 Accent 5" w:uiPriority="49"/>
-    <w:lsdException w:name="Grid Table 5 Dark Accent 5" w:uiPriority="50"/>
-    <w:lsdException w:name="Grid Table 6 Colorful Accent 5" w:uiPriority="51"/>
-    <w:lsdException w:name="Grid Table 7 Colorful Accent 5" w:uiPriority="52"/>
-    <w:lsdException w:name="Grid Table 1 Light Accent 6" w:uiPriority="46"/>
-    <w:lsdException w:name="Grid Table 2 Accent 6" w:uiPriority="47"/>
-    <w:lsdException w:name="Grid Table 3 Accent 6" w:uiPriority="48"/>
-    <w:lsdException w:name="Grid Table 4 Accent 6" w:uiPriority="49"/>
-    <w:lsdException w:name="Grid Table 5 Dark Accent 6" w:uiPriority="50"/>
-    <w:lsdException w:name="Grid Table 6 Colorful Accent 6" w:uiPriority="51"/>
-    <w:lsdException w:name="Grid Table 7 Colorful Accent 6" w:uiPriority="52"/>
-    <w:lsdException w:name="List Table 1 Light" w:uiPriority="46"/>
-    <w:lsdException w:name="List Table 2" w:uiPriority="47"/>
-    <w:lsdException w:name="List Table 3" w:uiPriority="48"/>
-    <w:lsdException w:name="List Table 4" w:uiPriority="49"/>
-    <w:lsdException w:name="List Table 5 Dark" w:uiPriority="50"/>
-    <w:lsdException w:name="List Table 6 Colorful" w:uiPriority="51"/>
-    <w:lsdException w:name="List Table 7 Colorful" w:uiPriority="52"/>
-    <w:lsdException w:name="List Table 1 Light Accent 1" w:uiPriority="46"/>
-    <w:lsdException w:name="List Table 2 Accent 1" w:uiPriority="47"/>
-    <w:lsdException w:name="List Table 3 Accent 1" w:uiPriority="48"/>
-    <w:lsdException w:name="List Table 4 Accent 1" w:uiPriority="49"/>
-    <w:lsdException w:name="List Table 5 Dark Accent 1" w:uiPriority="50"/>
-    <w:lsdException w:name="List Table 6 Colorful Accent 1" w:uiPriority="51"/>
-    <w:lsdException w:name="List Table 7 Colorful Accent 1" w:uiPriority="52"/>
-    <w:lsdException w:name="List Table 1 Light Accent 2" w:uiPriority="46"/>
-    <w:lsdException w:name="List Table 2 Accent 2" w:uiPriority="47"/>
-    <w:lsdException w:name="List Table 3 Accent 2" w:uiPriority="48"/>
-    <w:lsdException w:name="List Table 4 Accent 2" w:uiPriority="49"/>
-    <w:lsdException w:name="List Table 5 Dark Accent 2" w:uiPriority="50"/>
-    <w:lsdException w:name="List Table 6 Colorful Accent 2" w:uiPriority="51"/>
-    <w:lsdException w:name="List Table 7 Colorful Accent 2" w:uiPriority="52"/>
-    <w:lsdException w:name="List Table 1 Light Accent 3" w:uiPriority="46"/>
-    <w:lsdException w:name="List Table 2 Accent 3" w:uiPriority="47"/>
-    <w:lsdException w:name="List Table 3 Accent 3" w:uiPriority="48"/>
-    <w:lsdException w:name="List Table 4 Accent 3" w:uiPriority="49"/>
-    <w:lsdException w:name="List Table 5 Dark Accent 3" w:uiPriority="50"/>
-    <w:lsdException w:name="List Table 6 Colorful Accent 3" w:uiPriority="51"/>
-    <w:lsdException w:name="List Table 7 Colorful Accent 3" w:uiPriority="52"/>
-    <w:lsdException w:name="List Table 1 Light Accent 4" w:uiPriority="46"/>
-    <w:lsdException w:name="List Table 2 Accent 4" w:uiPriority="47"/>
-    <w:lsdException w:name="List Table 3 Accent 4" w:uiPriority="48"/>
-    <w:lsdException w:name="List Table 4 Accent 4" w:uiPriority="49"/>
-    <w:lsdException w:name="List Table 5 Dark Accent 4" w:uiPriority="50"/>
-    <w:lsdException w:name="List Table 6 Colorful Accent 4" w:uiPriority="51"/>
-    <w:lsdException w:name="List Table 7 Colorful Accent 4" w:uiPriority="52"/>
-    <w:lsdException w:name="List Table 1 Light Accent 5" w:uiPriority="46"/>
-    <w:lsdException w:name="List Table 2 Accent 5" w:uiPriority="47"/>
-    <w:lsdException w:name="List Table 3 Accent 5" w:uiPriority="48"/>
-    <w:lsdException w:name="List Table 4 Accent 5" w:uiPriority="49"/>
-    <w:lsdException w:name="List Table 5 Dark Accent 5" w:uiPriority="50"/>
-    <w:lsdException w:name="List Table 6 Colorful Accent 5" w:uiPriority="51"/>
-    <w:lsdException w:name="List Table 7 Colorful Accent 5" w:uiPriority="52"/>
-    <w:lsdException w:name="List Table 1 Light Accent 6" w:uiPriority="46"/>
-    <w:lsdException w:name="List Table 2 Accent 6" w:uiPriority="47"/>
-    <w:lsdException w:name="List Table 3 Accent 6" w:uiPriority="48"/>
-    <w:lsdException w:name="List Table 4 Accent 6" w:uiPriority="49"/>
-    <w:lsdException w:name="List Table 5 Dark Accent 6" w:uiPriority="50"/>
-    <w:lsdException w:name="List Table 6 Colorful Accent 6" w:uiPriority="51"/>
-    <w:lsdException w:name="List Table 7 Colorful Accent 6" w:uiPriority="52"/>
-    <w:lsdException w:name="Mention" w:semiHidden="1" w:unhideWhenUsed="1"/>
-    <w:lsdException w:name="Smart Hyperlink" w:semiHidden="1" w:unhideWhenUsed="1"/>
-    <w:lsdException w:name="Hashtag" w:semiHidden="1" w:unhideWhenUsed="1"/>
-    <w:lsdException w:name="Unresolved Mention" w:semiHidden="1" w:unhideWhenUsed="1"/>
-    <w:lsdException w:name="Smart Link" w:semiHidden="1" w:unhideWhenUsed="1"/>
+  <w:latentStyles w:count="260" w:defQFormat="0" w:defUnhideWhenUsed="1" w:defSemiHidden="1" w:defUIPriority="99" w:defLockedState="0">
+    <w:lsdException w:qFormat="1" w:unhideWhenUsed="0" w:uiPriority="0" w:semiHidden="0" w:name="Normal"/>
+    <w:lsdException w:qFormat="1" w:unhideWhenUsed="0" w:uiPriority="9" w:semiHidden="0" w:name="heading 1"/>
+    <w:lsdException w:qFormat="1" w:uiPriority="9" w:name="heading 2"/>
+    <w:lsdException w:qFormat="1" w:uiPriority="9" w:name="heading 3"/>
+    <w:lsdException w:qFormat="1" w:uiPriority="9" w:name="heading 4"/>
+    <w:lsdException w:qFormat="1" w:uiPriority="9" w:name="heading 5"/>
+    <w:lsdException w:qFormat="1" w:uiPriority="9" w:name="heading 6"/>
+    <w:lsdException w:qFormat="1" w:uiPriority="9" w:name="heading 7"/>
+    <w:lsdException w:qFormat="1" w:uiPriority="9" w:name="heading 8"/>
+    <w:lsdException w:qFormat="1" w:uiPriority="9" w:name="heading 9"/>
+    <w:lsdException w:uiPriority="99" w:name="index 1"/>
+    <w:lsdException w:uiPriority="99" w:name="index 2"/>
+    <w:lsdException w:uiPriority="99" w:name="index 3"/>
+    <w:lsdException w:uiPriority="99" w:name="index 4"/>
+    <w:lsdException w:uiPriority="99" w:name="index 5"/>
+    <w:lsdException w:uiPriority="99" w:name="index 6"/>
+    <w:lsdException w:uiPriority="99" w:name="index 7"/>
+    <w:lsdException w:uiPriority="99" w:name="index 8"/>
+    <w:lsdException w:uiPriority="99" w:name="index 9"/>
+    <w:lsdException w:uiPriority="39" w:name="toc 1"/>
+    <w:lsdException w:uiPriority="39" w:name="toc 2"/>
+    <w:lsdException w:uiPriority="39" w:name="toc 3"/>
+    <w:lsdException w:uiPriority="39" w:name="toc 4"/>
+    <w:lsdException w:uiPriority="39" w:name="toc 5"/>
+    <w:lsdException w:uiPriority="39" w:name="toc 6"/>
+    <w:lsdException w:uiPriority="39" w:name="toc 7"/>
+    <w:lsdException w:uiPriority="39" w:name="toc 8"/>
+    <w:lsdException w:uiPriority="39" w:name="toc 9"/>
+    <w:lsdException w:uiPriority="99" w:name="Normal Indent"/>
+    <w:lsdException w:uiPriority="99" w:name="footnote text"/>
+    <w:lsdException w:uiPriority="99" w:name="annotation text"/>
+    <w:lsdException w:qFormat="1" w:uiPriority="99" w:semiHidden="0" w:name="header"/>
+    <w:lsdException w:qFormat="1" w:uiPriority="99" w:semiHidden="0" w:name="footer"/>
+    <w:lsdException w:uiPriority="99" w:name="index heading"/>
+    <w:lsdException w:qFormat="1" w:uiPriority="35" w:name="caption"/>
+    <w:lsdException w:uiPriority="99" w:name="table of figures"/>
+    <w:lsdException w:uiPriority="99" w:name="envelope address"/>
+    <w:lsdException w:uiPriority="99" w:name="envelope return"/>
+    <w:lsdException w:uiPriority="99" w:name="footnote reference"/>
+    <w:lsdException w:uiPriority="99" w:name="annotation reference"/>
+    <w:lsdException w:uiPriority="99" w:name="line number"/>
+    <w:lsdException w:uiPriority="99" w:name="page number"/>
+    <w:lsdException w:uiPriority="99" w:name="endnote reference"/>
+    <w:lsdException w:uiPriority="99" w:name="endnote text"/>
+    <w:lsdException w:uiPriority="99" w:name="table of authorities"/>
+    <w:lsdException w:uiPriority="99" w:name="macro"/>
+    <w:lsdException w:uiPriority="99" w:name="toa heading"/>
+    <w:lsdException w:uiPriority="99" w:name="List"/>
+    <w:lsdException w:uiPriority="99" w:name="List Bullet"/>
+    <w:lsdException w:uiPriority="99" w:name="List Number"/>
+    <w:lsdException w:uiPriority="99" w:name="List 2"/>
+    <w:lsdException w:uiPriority="99" w:name="List 3"/>
+    <w:lsdException w:uiPriority="99" w:name="List 4"/>
+    <w:lsdException w:uiPriority="99" w:name="List 5"/>
+    <w:lsdException w:uiPriority="99" w:name="List Bullet 2"/>
+    <w:lsdException w:uiPriority="99" w:name="List Bullet 3"/>
+    <w:lsdException w:uiPriority="99" w:name="List Bullet 4"/>
+    <w:lsdException w:uiPriority="99" w:name="List Bullet 5"/>
+    <w:lsdException w:uiPriority="99" w:name="List Number 2"/>
+    <w:lsdException w:uiPriority="99" w:name="List Number 3"/>
+    <w:lsdException w:uiPriority="99" w:name="List Number 4"/>
+    <w:lsdException w:uiPriority="99" w:name="List Number 5"/>
+    <w:lsdException w:qFormat="1" w:unhideWhenUsed="0" w:uiPriority="10" w:semiHidden="0" w:name="Title"/>
+    <w:lsdException w:uiPriority="99" w:name="Closing"/>
+    <w:lsdException w:uiPriority="99" w:name="Signature"/>
+    <w:lsdException w:qFormat="1" w:uiPriority="1" w:name="Default Paragraph Font"/>
+    <w:lsdException w:uiPriority="99" w:name="Body Text"/>
+    <w:lsdException w:uiPriority="99" w:name="Body Text Indent"/>
+    <w:lsdException w:uiPriority="99" w:name="List Continue"/>
+    <w:lsdException w:uiPriority="99" w:name="List Continue 2"/>
+    <w:lsdException w:uiPriority="99" w:name="List Continue 3"/>
+    <w:lsdException w:uiPriority="99" w:name="List Continue 4"/>
+    <w:lsdException w:uiPriority="99" w:name="List Continue 5"/>
+    <w:lsdException w:uiPriority="99" w:name="Message Header"/>
+    <w:lsdException w:qFormat="1" w:unhideWhenUsed="0" w:uiPriority="11" w:semiHidden="0" w:name="Subtitle"/>
+    <w:lsdException w:uiPriority="99" w:name="Salutation"/>
+    <w:lsdException w:uiPriority="99" w:name="Date"/>
+    <w:lsdException w:uiPriority="99" w:name="Body Text First Indent"/>
+    <w:lsdException w:uiPriority="99" w:name="Body Text First Indent 2"/>
+    <w:lsdException w:uiPriority="99" w:name="Note Heading"/>
+    <w:lsdException w:uiPriority="99" w:name="Body Text 2"/>
+    <w:lsdException w:uiPriority="99" w:name="Body Text 3"/>
+    <w:lsdException w:uiPriority="99" w:name="Body Text Indent 2"/>
+    <w:lsdException w:uiPriority="99" w:name="Body Text Indent 3"/>
+    <w:lsdException w:uiPriority="99" w:name="Block Text"/>
+    <w:lsdException w:uiPriority="99" w:name="Hyperlink"/>
+    <w:lsdException w:uiPriority="99" w:name="FollowedHyperlink"/>
+    <w:lsdException w:qFormat="1" w:unhideWhenUsed="0" w:uiPriority="22" w:semiHidden="0" w:name="Strong"/>
+    <w:lsdException w:qFormat="1" w:unhideWhenUsed="0" w:uiPriority="20" w:semiHidden="0" w:name="Emphasis"/>
+    <w:lsdException w:uiPriority="99" w:name="Document Map"/>
+    <w:lsdException w:uiPriority="99" w:name="Plain Text"/>
+    <w:lsdException w:uiPriority="99" w:name="E-mail Signature"/>
+    <w:lsdException w:uiPriority="99" w:name="Normal (Web)"/>
+    <w:lsdException w:uiPriority="99" w:name="HTML Acronym"/>
+    <w:lsdException w:uiPriority="99" w:name="HTML Address"/>
+    <w:lsdException w:uiPriority="99" w:name="HTML Cite"/>
+    <w:lsdException w:uiPriority="99" w:name="HTML Code"/>
+    <w:lsdException w:uiPriority="99" w:name="HTML Definition"/>
+    <w:lsdException w:uiPriority="99" w:name="HTML Keyboard"/>
+    <w:lsdException w:uiPriority="99" w:name="HTML Preformatted"/>
+    <w:lsdException w:uiPriority="99" w:name="HTML Sample"/>
+    <w:lsdException w:uiPriority="99" w:name="HTML Typewriter"/>
+    <w:lsdException w:uiPriority="99" w:name="HTML Variable"/>
+    <w:lsdException w:qFormat="1" w:uiPriority="99" w:name="Normal Table"/>
+    <w:lsdException w:uiPriority="99" w:name="annotation subject"/>
+    <w:lsdException w:uiPriority="99" w:name="Table Simple 1"/>
+    <w:lsdException w:uiPriority="99" w:name="Table Simple 2"/>
+    <w:lsdException w:uiPriority="99" w:name="Table Simple 3"/>
+    <w:lsdException w:uiPriority="99" w:name="Table Classic 1"/>
+    <w:lsdException w:uiPriority="99" w:name="Table Classic 2"/>
+    <w:lsdException w:uiPriority="99" w:name="Table Classic 3"/>
+    <w:lsdException w:uiPriority="99" w:name="Table Classic 4"/>
+    <w:lsdException w:uiPriority="99" w:name="Table Colorful 1"/>
+    <w:lsdException w:uiPriority="99" w:name="Table Colorful 2"/>
+    <w:lsdException w:uiPriority="99" w:name="Table Colorful 3"/>
+    <w:lsdException w:uiPriority="99" w:name="Table Columns 1"/>
+    <w:lsdException w:uiPriority="99" w:name="Table Columns 2"/>
+    <w:lsdException w:uiPriority="99" w:name="Table Columns 3"/>
+    <w:lsdException w:uiPriority="99" w:name="Table Columns 4"/>
+    <w:lsdException w:uiPriority="99" w:name="Table Columns 5"/>
+    <w:lsdException w:uiPriority="99" w:name="Table Grid 1"/>
+    <w:lsdException w:uiPriority="99" w:name="Table Grid 2"/>
+    <w:lsdException w:uiPriority="99" w:name="Table Grid 3"/>
+    <w:lsdException w:uiPriority="99" w:name="Table Grid 4"/>
+    <w:lsdException w:uiPriority="99" w:name="Table Grid 5"/>
+    <w:lsdException w:uiPriority="99" w:name="Table Grid 6"/>
+    <w:lsdException w:uiPriority="99" w:name="Table Grid 7"/>
+    <w:lsdException w:uiPriority="99" w:name="Table Grid 8"/>
+    <w:lsdException w:uiPriority="99" w:name="Table List 1"/>
+    <w:lsdException w:uiPriority="99" w:name="Table List 2"/>
+    <w:lsdException w:uiPriority="99" w:name="Table List 3"/>
+    <w:lsdException w:uiPriority="99" w:name="Table List 4"/>
+    <w:lsdException w:uiPriority="99" w:name="Table List 5"/>
+    <w:lsdException w:uiPriority="99" w:name="Table List 6"/>
+    <w:lsdException w:uiPriority="99" w:name="Table List 7"/>
+    <w:lsdException w:uiPriority="99" w:name="Table List 8"/>
+    <w:lsdException w:uiPriority="99" w:name="Table 3D effects 1"/>
+    <w:lsdException w:uiPriority="99" w:name="Table 3D effects 2"/>
+    <w:lsdException w:uiPriority="99" w:name="Table 3D effects 3"/>
+    <w:lsdException w:uiPriority="99" w:name="Table Contemporary"/>
+    <w:lsdException w:uiPriority="99" w:name="Table Elegant"/>
+    <w:lsdException w:uiPriority="99" w:name="Table Professional"/>
+    <w:lsdException w:uiPriority="99" w:name="Table Subtle 1"/>
+    <w:lsdException w:uiPriority="99" w:name="Table Subtle 2"/>
+    <w:lsdException w:uiPriority="99" w:name="Table Web 1"/>
+    <w:lsdException w:uiPriority="99" w:name="Table Web 2"/>
+    <w:lsdException w:uiPriority="99" w:name="Table Web 3"/>
+    <w:lsdException w:qFormat="1" w:uiPriority="99" w:name="Balloon Text"/>
+    <w:lsdException w:qFormat="1" w:unhideWhenUsed="0" w:uiPriority="39" w:semiHidden="0" w:name="Table Grid"/>
+    <w:lsdException w:uiPriority="99" w:name="Table Theme"/>
+    <w:lsdException w:unhideWhenUsed="0" w:uiPriority="60" w:semiHidden="0" w:name="Light Shading"/>
+    <w:lsdException w:unhideWhenUsed="0" w:uiPriority="61" w:semiHidden="0" w:name="Light List"/>
+    <w:lsdException w:unhideWhenUsed="0" w:uiPriority="62" w:semiHidden="0" w:name="Light Grid"/>
+    <w:lsdException w:unhideWhenUsed="0" w:uiPriority="63" w:semiHidden="0" w:name="Medium Shading 1"/>
+    <w:lsdException w:unhideWhenUsed="0" w:uiPriority="64" w:semiHidden="0" w:name="Medium Shading 2"/>
+    <w:lsdException w:unhideWhenUsed="0" w:uiPriority="65" w:semiHidden="0" w:name="Medium List 1"/>
+    <w:lsdException w:unhideWhenUsed="0" w:uiPriority="66" w:semiHidden="0" w:name="Medium List 2"/>
+    <w:lsdException w:unhideWhenUsed="0" w:uiPriority="67" w:semiHidden="0" w:name="Medium Grid 1"/>
+    <w:lsdException w:unhideWhenUsed="0" w:uiPriority="68" w:semiHidden="0" w:name="Medium Grid 2"/>
+    <w:lsdException w:unhideWhenUsed="0" w:uiPriority="69" w:semiHidden="0" w:name="Medium Grid 3"/>
+    <w:lsdException w:unhideWhenUsed="0" w:uiPriority="70" w:semiHidden="0" w:name="Dark List"/>
+    <w:lsdException w:unhideWhenUsed="0" w:uiPriority="71" w:semiHidden="0" w:name="Colorful Shading"/>
+    <w:lsdException w:unhideWhenUsed="0" w:uiPriority="72" w:semiHidden="0" w:name="Colorful List"/>
+    <w:lsdException w:unhideWhenUsed="0" w:uiPriority="73" w:semiHidden="0" w:name="Colorful Grid"/>
+    <w:lsdException w:unhideWhenUsed="0" w:uiPriority="60" w:semiHidden="0" w:name="Light Shading Accent 1"/>
+    <w:lsdException w:unhideWhenUsed="0" w:uiPriority="61" w:semiHidden="0" w:name="Light List Accent 1"/>
+    <w:lsdException w:unhideWhenUsed="0" w:uiPriority="62" w:semiHidden="0" w:name="Light Grid Accent 1"/>
+    <w:lsdException w:unhideWhenUsed="0" w:uiPriority="63" w:semiHidden="0" w:name="Medium Shading 1 Accent 1"/>
+    <w:lsdException w:unhideWhenUsed="0" w:uiPriority="64" w:semiHidden="0" w:name="Medium Shading 2 Accent 1"/>
+    <w:lsdException w:unhideWhenUsed="0" w:uiPriority="65" w:semiHidden="0" w:name="Medium List 1 Accent 1"/>
+    <w:lsdException w:unhideWhenUsed="0" w:uiPriority="66" w:semiHidden="0" w:name="Medium List 2 Accent 1"/>
+    <w:lsdException w:unhideWhenUsed="0" w:uiPriority="67" w:semiHidden="0" w:name="Medium Grid 1 Accent 1"/>
+    <w:lsdException w:unhideWhenUsed="0" w:uiPriority="68" w:semiHidden="0" w:name="Medium Grid 2 Accent 1"/>
+    <w:lsdException w:unhideWhenUsed="0" w:uiPriority="69" w:semiHidden="0" w:name="Medium Grid 3 Accent 1"/>
+    <w:lsdException w:unhideWhenUsed="0" w:uiPriority="70" w:semiHidden="0" w:name="Dark List Accent 1"/>
+    <w:lsdException w:unhideWhenUsed="0" w:uiPriority="71" w:semiHidden="0" w:name="Colorful Shading Accent 1"/>
+    <w:lsdException w:unhideWhenUsed="0" w:uiPriority="72" w:semiHidden="0" w:name="Colorful List Accent 1"/>
+    <w:lsdException w:unhideWhenUsed="0" w:uiPriority="73" w:semiHidden="0" w:name="Colorful Grid Accent 1"/>
+    <w:lsdException w:unhideWhenUsed="0" w:uiPriority="60" w:semiHidden="0" w:name="Light Shading Accent 2"/>
+    <w:lsdException w:unhideWhenUsed="0" w:uiPriority="61" w:semiHidden="0" w:name="Light List Accent 2"/>
+    <w:lsdException w:unhideWhenUsed="0" w:uiPriority="62" w:semiHidden="0" w:name="Light Grid Accent 2"/>
+    <w:lsdException w:unhideWhenUsed="0" w:uiPriority="63" w:semiHidden="0" w:name="Medium Shading 1 Accent 2"/>
+    <w:lsdException w:unhideWhenUsed="0" w:uiPriority="64" w:semiHidden="0" w:name="Medium Shading 2 Accent 2"/>
+    <w:lsdException w:unhideWhenUsed="0" w:uiPriority="65" w:semiHidden="0" w:name="Medium List 1 Accent 2"/>
+    <w:lsdException w:unhideWhenUsed="0" w:uiPriority="66" w:semiHidden="0" w:name="Medium List 2 Accent 2"/>
+    <w:lsdException w:unhideWhenUsed="0" w:uiPriority="67" w:semiHidden="0" w:name="Medium Grid 1 Accent 2"/>
+    <w:lsdException w:unhideWhenUsed="0" w:uiPriority="68" w:semiHidden="0" w:name="Medium Grid 2 Accent 2"/>
+    <w:lsdException w:unhideWhenUsed="0" w:uiPriority="69" w:semiHidden="0" w:name="Medium Grid 3 Accent 2"/>
+    <w:lsdException w:unhideWhenUsed="0" w:uiPriority="70" w:semiHidden="0" w:name="Dark List Accent 2"/>
+    <w:lsdException w:unhideWhenUsed="0" w:uiPriority="71" w:semiHidden="0" w:name="Colorful Shading Accent 2"/>
+    <w:lsdException w:unhideWhenUsed="0" w:uiPriority="72" w:semiHidden="0" w:name="Colorful List Accent 2"/>
+    <w:lsdException w:unhideWhenUsed="0" w:uiPriority="73" w:semiHidden="0" w:name="Colorful Grid Accent 2"/>
+    <w:lsdException w:unhideWhenUsed="0" w:uiPriority="60" w:semiHidden="0" w:name="Light Shading Accent 3"/>
+    <w:lsdException w:unhideWhenUsed="0" w:uiPriority="61" w:semiHidden="0" w:name="Light List Accent 3"/>
+    <w:lsdException w:unhideWhenUsed="0" w:uiPriority="62" w:semiHidden="0" w:name="Light Grid Accent 3"/>
+    <w:lsdException w:unhideWhenUsed="0" w:uiPriority="63" w:semiHidden="0" w:name="Medium Shading 1 Accent 3"/>
+    <w:lsdException w:unhideWhenUsed="0" w:uiPriority="64" w:semiHidden="0" w:name="Medium Shading 2 Accent 3"/>
+    <w:lsdException w:unhideWhenUsed="0" w:uiPriority="65" w:semiHidden="0" w:name="Medium List 1 Accent 3"/>
+    <w:lsdException w:unhideWhenUsed="0" w:uiPriority="66" w:semiHidden="0" w:name="Medium List 2 Accent 3"/>
+    <w:lsdException w:unhideWhenUsed="0" w:uiPriority="67" w:semiHidden="0" w:name="Medium Grid 1 Accent 3"/>
+    <w:lsdException w:unhideWhenUsed="0" w:uiPriority="68" w:semiHidden="0" w:name="Medium Grid 2 Accent 3"/>
+    <w:lsdException w:unhideWhenUsed="0" w:uiPriority="69" w:semiHidden="0" w:name="Medium Grid 3 Accent 3"/>
+    <w:lsdException w:unhideWhenUsed="0" w:uiPriority="70" w:semiHidden="0" w:name="Dark List Accent 3"/>
+    <w:lsdException w:unhideWhenUsed="0" w:uiPriority="71" w:semiHidden="0" w:name="Colorful Shading Accent 3"/>
+    <w:lsdException w:unhideWhenUsed="0" w:uiPriority="72" w:semiHidden="0" w:name="Colorful List Accent 3"/>
+    <w:lsdException w:unhideWhenUsed="0" w:uiPriority="73" w:semiHidden="0" w:name="Colorful Grid Accent 3"/>
+    <w:lsdException w:unhideWhenUsed="0" w:uiPriority="60" w:semiHidden="0" w:name="Light Shading Accent 4"/>
+    <w:lsdException w:unhideWhenUsed="0" w:uiPriority="61" w:semiHidden="0" w:name="Light List Accent 4"/>
+    <w:lsdException w:unhideWhenUsed="0" w:uiPriority="62" w:semiHidden="0" w:name="Light Grid Accent 4"/>
+    <w:lsdException w:unhideWhenUsed="0" w:uiPriority="63" w:semiHidden="0" w:name="Medium Shading 1 Accent 4"/>
+    <w:lsdException w:unhideWhenUsed="0" w:uiPriority="64" w:semiHidden="0" w:name="Medium Shading 2 Accent 4"/>
+    <w:lsdException w:unhideWhenUsed="0" w:uiPriority="65" w:semiHidden="0" w:name="Medium List 1 Accent 4"/>
+    <w:lsdException w:unhideWhenUsed="0" w:uiPriority="66" w:semiHidden="0" w:name="Medium List 2 Accent 4"/>
+    <w:lsdException w:unhideWhenUsed="0" w:uiPriority="67" w:semiHidden="0" w:name="Medium Grid 1 Accent 4"/>
+    <w:lsdException w:unhideWhenUsed="0" w:uiPriority="68" w:semiHidden="0" w:name="Medium Grid 2 Accent 4"/>
+    <w:lsdException w:unhideWhenUsed="0" w:uiPriority="69" w:semiHidden="0" w:name="Medium Grid 3 Accent 4"/>
+    <w:lsdException w:unhideWhenUsed="0" w:uiPriority="70" w:semiHidden="0" w:name="Dark List Accent 4"/>
+    <w:lsdException w:unhideWhenUsed="0" w:uiPriority="71" w:semiHidden="0" w:name="Colorful Shading Accent 4"/>
+    <w:lsdException w:unhideWhenUsed="0" w:uiPriority="72" w:semiHidden="0" w:name="Colorful List Accent 4"/>
+    <w:lsdException w:unhideWhenUsed="0" w:uiPriority="73" w:semiHidden="0" w:name="Colorful Grid Accent 4"/>
+    <w:lsdException w:unhideWhenUsed="0" w:uiPriority="60" w:semiHidden="0" w:name="Light Shading Accent 5"/>
+    <w:lsdException w:unhideWhenUsed="0" w:uiPriority="61" w:semiHidden="0" w:name="Light List Accent 5"/>
+    <w:lsdException w:unhideWhenUsed="0" w:uiPriority="62" w:semiHidden="0" w:name="Light Grid Accent 5"/>
+    <w:lsdException w:unhideWhenUsed="0" w:uiPriority="63" w:semiHidden="0" w:name="Medium Shading 1 Accent 5"/>
+    <w:lsdException w:unhideWhenUsed="0" w:uiPriority="64" w:semiHidden="0" w:name="Medium Shading 2 Accent 5"/>
+    <w:lsdException w:unhideWhenUsed="0" w:uiPriority="65" w:semiHidden="0" w:name="Medium List 1 Accent 5"/>
+    <w:lsdException w:unhideWhenUsed="0" w:uiPriority="66" w:semiHidden="0" w:name="Medium List 2 Accent 5"/>
+    <w:lsdException w:unhideWhenUsed="0" w:uiPriority="67" w:semiHidden="0" w:name="Medium Grid 1 Accent 5"/>
+    <w:lsdException w:unhideWhenUsed="0" w:uiPriority="68" w:semiHidden="0" w:name="Medium Grid 2 Accent 5"/>
+    <w:lsdException w:unhideWhenUsed="0" w:uiPriority="69" w:semiHidden="0" w:name="Medium Grid 3 Accent 5"/>
+    <w:lsdException w:unhideWhenUsed="0" w:uiPriority="70" w:semiHidden="0" w:name="Dark List Accent 5"/>
+    <w:lsdException w:unhideWhenUsed="0" w:uiPriority="71" w:semiHidden="0" w:name="Colorful Shading Accent 5"/>
+    <w:lsdException w:unhideWhenUsed="0" w:uiPriority="72" w:semiHidden="0" w:name="Colorful List Accent 5"/>
+    <w:lsdException w:unhideWhenUsed="0" w:uiPriority="73" w:semiHidden="0" w:name="Colorful Grid Accent 5"/>
+    <w:lsdException w:unhideWhenUsed="0" w:uiPriority="60" w:semiHidden="0" w:name="Light Shading Accent 6"/>
+    <w:lsdException w:unhideWhenUsed="0" w:uiPriority="61" w:semiHidden="0" w:name="Light List Accent 6"/>
+    <w:lsdException w:unhideWhenUsed="0" w:uiPriority="62" w:semiHidden="0" w:name="Light Grid Accent 6"/>
+    <w:lsdException w:unhideWhenUsed="0" w:uiPriority="63" w:semiHidden="0" w:name="Medium Shading 1 Accent 6"/>
+    <w:lsdException w:unhideWhenUsed="0" w:uiPriority="64" w:semiHidden="0" w:name="Medium Shading 2 Accent 6"/>
+    <w:lsdException w:unhideWhenUsed="0" w:uiPriority="65" w:semiHidden="0" w:name="Medium List 1 Accent 6"/>
+    <w:lsdException w:unhideWhenUsed="0" w:uiPriority="66" w:semiHidden="0" w:name="Medium List 2 Accent 6"/>
+    <w:lsdException w:unhideWhenUsed="0" w:uiPriority="67" w:semiHidden="0" w:name="Medium Grid 1 Accent 6"/>
+    <w:lsdException w:unhideWhenUsed="0" w:uiPriority="68" w:semiHidden="0" w:name="Medium Grid 2 Accent 6"/>
+    <w:lsdException w:unhideWhenUsed="0" w:uiPriority="69" w:semiHidden="0" w:name="Medium Grid 3 Accent 6"/>
+    <w:lsdException w:unhideWhenUsed="0" w:uiPriority="70" w:semiHidden="0" w:name="Dark List Accent 6"/>
+    <w:lsdException w:unhideWhenUsed="0" w:uiPriority="71" w:semiHidden="0" w:name="Colorful Shading Accent 6"/>
+    <w:lsdException w:unhideWhenUsed="0" w:uiPriority="72" w:semiHidden="0" w:name="Colorful List Accent 6"/>
+    <w:lsdException w:unhideWhenUsed="0" w:uiPriority="73" w:semiHidden="0" w:name="Colorful Grid Accent 6"/>
   </w:latentStyles>
-  <w:style w:type="paragraph" w:default="1" w:styleId="Normal">
+  <w:style w:type="paragraph" w:default="1" w:styleId="1">
     <w:name w:val="Normal"/>
     <w:qFormat/>
+    <w:uiPriority w:val="0"/>
+    <w:pPr>
+      <w:spacing w:after="160" w:line="259" w:lineRule="auto"/>
+    </w:pPr>
     <w:rPr>
+      <w:rFonts w:asciiTheme="minorHAnsi" w:hAnsiTheme="minorHAnsi" w:eastAsiaTheme="minorHAnsi" w:cstheme="minorBidi"/>
       <w:sz w:val="22"/>
       <w:szCs w:val="22"/>
+      <w:lang w:val="en-US" w:eastAsia="en-US" w:bidi="ar-SA"/>
     </w:rPr>
   </w:style>
-  <w:style w:type="character" w:default="1" w:styleId="DefaultParagraphFont">
+  <w:style w:type="character" w:default="1" w:styleId="2">
     <w:name w:val="Default Paragraph Font"/>
-    <w:uiPriority w:val="1"/>
     <w:semiHidden/>
     <w:unhideWhenUsed/>
+    <w:qFormat/>
+    <w:uiPriority w:val="1"/>
   </w:style>
-  <w:style w:type="table" w:default="1" w:styleId="TableNormal">
+  <w:style w:type="table" w:default="1" w:styleId="3">
     <w:name w:val="Normal Table"/>
-    <w:uiPriority w:val="99"/>
     <w:semiHidden/>
     <w:unhideWhenUsed/>
+    <w:qFormat/>
+    <w:uiPriority w:val="99"/>
     <w:tblPr>
-      <w:tblInd w:w="0" w:type="dxa"/>
       <w:tblCellMar>
         <w:top w:w="0" w:type="dxa"/>
         <w:left w:w="108" w:type="dxa"/>
@@ -1807,20 +2340,14 @@
       </w:tblCellMar>
     </w:tblPr>
   </w:style>
-  <w:style w:type="numbering" w:default="1" w:styleId="NoList">
-    <w:name w:val="No List"/>
-    <w:uiPriority w:val="99"/>
-    <w:semiHidden/>
-    <w:unhideWhenUsed/>
-  </w:style>
-  <w:style w:type="paragraph" w:styleId="BalloonText">
+  <w:style w:type="paragraph" w:styleId="4">
     <w:name w:val="Balloon Text"/>
-    <w:basedOn w:val="Normal"/>
-    <w:link w:val="BalloonTextChar"/>
-    <w:uiPriority w:val="99"/>
+    <w:basedOn w:val="1"/>
+    <w:link w:val="10"/>
     <w:semiHidden/>
     <w:unhideWhenUsed/>
     <w:qFormat/>
+    <w:uiPriority w:val="99"/>
     <w:pPr>
       <w:spacing w:after="0" w:line="240" w:lineRule="auto"/>
     </w:pPr>
@@ -1830,12 +2357,13 @@
       <w:szCs w:val="18"/>
     </w:rPr>
   </w:style>
-  <w:style w:type="paragraph" w:styleId="Footer">
+  <w:style w:type="paragraph" w:styleId="5">
     <w:name w:val="footer"/>
-    <w:basedOn w:val="Normal"/>
-    <w:link w:val="FooterChar"/>
+    <w:basedOn w:val="1"/>
+    <w:link w:val="9"/>
+    <w:unhideWhenUsed/>
+    <w:qFormat/>
     <w:uiPriority w:val="99"/>
-    <w:unhideWhenUsed/>
     <w:pPr>
       <w:tabs>
         <w:tab w:val="center" w:pos="4680"/>
@@ -1844,12 +2372,13 @@
       <w:spacing w:after="0" w:line="240" w:lineRule="auto"/>
     </w:pPr>
   </w:style>
-  <w:style w:type="paragraph" w:styleId="Header">
+  <w:style w:type="paragraph" w:styleId="6">
     <w:name w:val="header"/>
-    <w:basedOn w:val="Normal"/>
-    <w:link w:val="HeaderChar"/>
+    <w:basedOn w:val="1"/>
+    <w:link w:val="8"/>
+    <w:unhideWhenUsed/>
+    <w:qFormat/>
     <w:uiPriority w:val="99"/>
-    <w:unhideWhenUsed/>
     <w:pPr>
       <w:tabs>
         <w:tab w:val="center" w:pos="4680"/>
@@ -1858,43 +2387,46 @@
       <w:spacing w:after="0" w:line="240" w:lineRule="auto"/>
     </w:pPr>
   </w:style>
-  <w:style w:type="table" w:styleId="TableGrid">
+  <w:style w:type="table" w:styleId="7">
     <w:name w:val="Table Grid"/>
-    <w:basedOn w:val="TableNormal"/>
+    <w:basedOn w:val="3"/>
+    <w:qFormat/>
     <w:uiPriority w:val="39"/>
     <w:pPr>
       <w:spacing w:after="0" w:line="240" w:lineRule="auto"/>
     </w:pPr>
     <w:tblPr>
       <w:tblBorders>
-        <w:top w:val="single" w:sz="4" w:space="0" w:color="auto"/>
-        <w:left w:val="single" w:sz="4" w:space="0" w:color="auto"/>
-        <w:bottom w:val="single" w:sz="4" w:space="0" w:color="auto"/>
-        <w:right w:val="single" w:sz="4" w:space="0" w:color="auto"/>
-        <w:insideH w:val="single" w:sz="4" w:space="0" w:color="auto"/>
-        <w:insideV w:val="single" w:sz="4" w:space="0" w:color="auto"/>
+        <w:top w:val="single" w:color="auto" w:sz="4" w:space="0"/>
+        <w:left w:val="single" w:color="auto" w:sz="4" w:space="0"/>
+        <w:bottom w:val="single" w:color="auto" w:sz="4" w:space="0"/>
+        <w:right w:val="single" w:color="auto" w:sz="4" w:space="0"/>
+        <w:insideH w:val="single" w:color="auto" w:sz="4" w:space="0"/>
+        <w:insideV w:val="single" w:color="auto" w:sz="4" w:space="0"/>
       </w:tblBorders>
     </w:tblPr>
   </w:style>
-  <w:style w:type="character" w:customStyle="1" w:styleId="HeaderChar">
+  <w:style w:type="character" w:customStyle="1" w:styleId="8">
     <w:name w:val="Header Char"/>
-    <w:basedOn w:val="DefaultParagraphFont"/>
-    <w:link w:val="Header"/>
-    <w:uiPriority w:val="99"/>
+    <w:basedOn w:val="2"/>
+    <w:link w:val="6"/>
     <w:qFormat/>
-  </w:style>
-  <w:style w:type="character" w:customStyle="1" w:styleId="FooterChar">
-    <w:name w:val="Footer Char"/>
-    <w:basedOn w:val="DefaultParagraphFont"/>
-    <w:link w:val="Footer"/>
     <w:uiPriority w:val="99"/>
   </w:style>
-  <w:style w:type="character" w:customStyle="1" w:styleId="BalloonTextChar">
+  <w:style w:type="character" w:customStyle="1" w:styleId="9">
+    <w:name w:val="Footer Char"/>
+    <w:basedOn w:val="2"/>
+    <w:link w:val="5"/>
+    <w:qFormat/>
+    <w:uiPriority w:val="99"/>
+  </w:style>
+  <w:style w:type="character" w:customStyle="1" w:styleId="10">
     <w:name w:val="Balloon Text Char"/>
-    <w:basedOn w:val="DefaultParagraphFont"/>
-    <w:link w:val="BalloonText"/>
+    <w:basedOn w:val="2"/>
+    <w:link w:val="4"/>
+    <w:semiHidden/>
+    <w:qFormat/>
     <w:uiPriority w:val="99"/>
-    <w:semiHidden/>
     <w:rPr>
       <w:rFonts w:ascii="Segoe UI" w:hAnsi="Segoe UI" w:cs="Segoe UI"/>
       <w:sz w:val="18"/>
@@ -2156,15 +2688,12 @@
     </a:fmtScheme>
   </a:themeElements>
   <a:objectDefaults/>
-  <a:extraClrSchemeLst/>
 </a:theme>
 </file>
 
 <file path=customXml/item1.xml><?xml version="1.0" encoding="utf-8"?>
 <s:customData xmlns="http://www.wps.cn/officeDocument/2013/wpsCustomData" xmlns:s="http://www.wps.cn/officeDocument/2013/wpsCustomData">
-  <customSectProps>
-    <customSectPr/>
-  </customSectProps>
+  <customSectProps/>
   <customShpExts>
     <customShpInfo spid="_x0000_s1026" textRotate="1"/>
   </customShpExts>

</xml_diff>